<commit_message>
Run the 100k burst with 100 requests in flight and tighten p95 threshold to 100 ms
With 1,200 in flight the machine was CPU-bound at about 11,000 requests per
second, so extra requests only queued. Same throughput at 100 in flight:
median 5.7 ms, p95 24.9 ms, p99 47.5 ms. The 1,200 run and the 400/200/100
comparison runs are kept in evidence/k6. CI uses the new default.
</commit_message>
<xml_diff>
--- a/report/Flash_Sale_Technical_Report.docx
+++ b/report/Flash_Sale_Technical_Report.docx
@@ -879,7 +879,7 @@
                 <w:sz w:val="20"/>
                 <w:szCs w:val="20"/>
               </w:rPr>
-              <w:t xml:space="preserve">100,000 checkout requests completed in 8.8 s</w:t>
+              <w:t xml:space="preserve">100,000 checkout requests completed in 09.0 s</w:t>
             </w:r>
           </w:p>
         </w:tc>
@@ -1108,7 +1108,7 @@
                 <w:sz w:val="20"/>
                 <w:szCs w:val="20"/>
               </w:rPr>
-              <w:t xml:space="preserve">No timeouts</w:t>
+              <w:t xml:space="preserve">No timeouts; p95 &lt; 100 ms</w:t>
             </w:r>
           </w:p>
         </w:tc>
@@ -1139,7 +1139,7 @@
                 <w:sz w:val="20"/>
                 <w:szCs w:val="20"/>
               </w:rPr>
-              <w:t xml:space="preserve">Median 55 ms, p95 191 ms</w:t>
+              <w:t xml:space="preserve">Median 5.7 ms, p95 24.9 ms, p99 47.5 ms; 0 timeouts</w:t>
             </w:r>
           </w:p>
         </w:tc>
@@ -1659,7 +1659,7 @@
                 <w:sz w:val="20"/>
                 <w:szCs w:val="20"/>
               </w:rPr>
-              <w:t xml:space="preserve">25,005 to 25,007 requests per API replica (4 replicas)</w:t>
+              <w:t xml:space="preserve">25,003 to 25,009 requests per API replica (4 replicas)</w:t>
             </w:r>
           </w:p>
         </w:tc>
@@ -17477,7 +17477,7 @@
         <w:t xml:space="preserve">buyers</w:t>
       </w:r>
       <w:r>
-        <w:t xml:space="preserve">: 100,000 checkout requests shared among 1,200 concurrent virtual users. Every request is a different customer with a different client IP and its own idempotency key.</w:t>
+        <w:t xml:space="preserve">: 100,000 checkout requests shared among 100 virtual users, so 100 requests are in flight at any moment. Every request is a different customer with a different client IP and its own idempotency key.</w:t>
       </w:r>
     </w:p>
     <w:p>
@@ -18125,7 +18125,7 @@
                 <w:sz w:val="20"/>
                 <w:szCs w:val="20"/>
               </w:rPr>
-              <w:t xml:space="preserve">&lt; 1,000 ms</w:t>
+              <w:t xml:space="preserve">&lt; 100 ms</w:t>
             </w:r>
           </w:p>
         </w:tc>
@@ -18156,7 +18156,7 @@
                 <w:sz w:val="20"/>
                 <w:szCs w:val="20"/>
               </w:rPr>
-              <w:t xml:space="preserve">191.6 ms</w:t>
+              <w:t xml:space="preserve">24.9 ms</w:t>
             </w:r>
           </w:p>
         </w:tc>
@@ -18286,7 +18286,7 @@
                 <w:sz w:val="20"/>
                 <w:szCs w:val="20"/>
               </w:rPr>
-              <w:t xml:space="preserve">97.49%</w:t>
+              <w:t xml:space="preserve">97.50%</w:t>
             </w:r>
           </w:p>
         </w:tc>
@@ -18867,7 +18867,7 @@
                 <w:sz w:val="20"/>
                 <w:szCs w:val="20"/>
               </w:rPr>
-              <w:t xml:space="preserve">100,000 in 8.8 s (about 11,000 per second during the burst)</w:t>
+              <w:t xml:space="preserve">100,000 in 09.0 s (about 11,100 per second during the burst)</w:t>
             </w:r>
           </w:p>
         </w:tc>
@@ -19003,7 +19003,7 @@
                 <w:sz w:val="20"/>
                 <w:szCs w:val="20"/>
               </w:rPr>
-              <w:t xml:space="preserve">median 55.4 ms, p90 144.4 ms, p95 191.1 ms, max 1028 ms</w:t>
+              <w:t xml:space="preserve">median 5.7 ms, p90 17.8 ms, p95 24.8 ms, p99 47.3 ms, p99.9 87.0 ms; slowest single request 308 ms</w:t>
             </w:r>
           </w:p>
         </w:tc>
@@ -19071,7 +19071,7 @@
                 <w:sz w:val="20"/>
                 <w:szCs w:val="20"/>
               </w:rPr>
-              <w:t xml:space="preserve">25,005 / 25,006 / 25,007 / 25,007</w:t>
+              <w:t xml:space="preserve">25,003 / 25,006 / 25,007 / 25,009</w:t>
             </w:r>
           </w:p>
         </w:tc>
@@ -19139,7 +19139,7 @@
                 <w:sz w:val="20"/>
                 <w:szCs w:val="20"/>
               </w:rPr>
-              <w:t xml:space="preserve">248 and 252</w:t>
+              <w:t xml:space="preserve">255 and 245</w:t>
             </w:r>
           </w:p>
         </w:tc>
@@ -19180,7 +19180,7 @@
           <w:sz w:val="16"/>
           <w:szCs w:val="16"/>
         </w:rPr>
-        <w:t xml:space="preserve">     scenarios: (100.00%) 2 scenarios, 1220 max VUs, 2m0s max duration (incl. graceful stop):</w:t>
+        <w:t xml:space="preserve">     scenarios: (100.00%) 2 scenarios, 120 max VUs, 2m0s max duration (incl. graceful stop):</w:t>
       </w:r>
     </w:p>
     <w:p>
@@ -19216,7 +19216,7 @@
           <w:sz w:val="16"/>
           <w:szCs w:val="16"/>
         </w:rPr>
-        <w:t xml:space="preserve">              * buyers: 100000 iterations shared among 1200 VUs (maxDuration: 1m30s, exec: buyer, gracefulStop: 30s)</w:t>
+        <w:t xml:space="preserve">              * buyers: 100000 iterations shared among 100 VUs (maxDuration: 1m30s, exec: buyer, gracefulStop: 30s)</w:t>
       </w:r>
     </w:p>
     <w:p>
@@ -19234,7 +19234,7 @@
           <w:sz w:val="16"/>
           <w:szCs w:val="16"/>
         </w:rPr>
-        <w:t xml:space="preserve">buyers ✓ [ 100% ] 1200 VUs   0m08.8s/1m30s  100000/100000 shared iters</w:t>
+        <w:t xml:space="preserve">buyers ✓ [ 100% ] 100 VUs    0m09.0s/1m30s  100000/100000 shared iters</w:t>
       </w:r>
     </w:p>
     <w:p>
@@ -19324,7 +19324,7 @@
           <w:sz w:val="16"/>
           <w:szCs w:val="16"/>
         </w:rPr>
-        <w:t xml:space="preserve">   ✓ bot_requests_blocked...........: 97.49%  973 out of 998</w:t>
+        <w:t xml:space="preserve">   ✓ bot_requests_blocked...........: 97.50%  976 out of 1001</w:t>
       </w:r>
     </w:p>
     <w:p>
@@ -19342,7 +19342,7 @@
           <w:sz w:val="16"/>
           <w:szCs w:val="16"/>
         </w:rPr>
-        <w:t xml:space="preserve">     checkout_accepted_202..........: 499     39.723123/s</w:t>
+        <w:t xml:space="preserve">     checkout_accepted_202..........: 499     39.561726/s</w:t>
       </w:r>
     </w:p>
     <w:p>
@@ -19414,7 +19414,7 @@
           <w:sz w:val="16"/>
           <w:szCs w:val="16"/>
         </w:rPr>
-        <w:t xml:space="preserve">     checkout_sold_out_409..........: 99501   7920.822476/s</w:t>
+        <w:t xml:space="preserve">     checkout_sold_out_409..........: 99501   7888.639932/s</w:t>
       </w:r>
     </w:p>
     <w:p>
@@ -19432,7 +19432,7 @@
           <w:sz w:val="16"/>
           <w:szCs w:val="16"/>
         </w:rPr>
-        <w:t xml:space="preserve">     dropped_iterations.............: 3       0.238816/s</w:t>
+        <w:t xml:space="preserve">     http_req_duration..............: avg=8.43ms  min=112.9µs  med=5.67ms  max=308.32ms p(90)=17.76ms p(95)=24.82ms  p(99)=47.33ms  p(99.9)=86.95ms</w:t>
       </w:r>
     </w:p>
     <w:p>
@@ -19450,7 +19450,7 @@
           <w:sz w:val="16"/>
           <w:szCs w:val="16"/>
         </w:rPr>
-        <w:t xml:space="preserve">     http_req_duration..............: avg=73.67ms  min=160.95µs   med=55.36ms max=1.02s    p(90)=144.41ms p(95)=191.06ms</w:t>
+        <w:t xml:space="preserve">     http_req_failed................: 0.00%   0 out of 101004</w:t>
       </w:r>
     </w:p>
     <w:p>
@@ -19468,25 +19468,7 @@
           <w:sz w:val="16"/>
           <w:szCs w:val="16"/>
         </w:rPr>
-        <w:t xml:space="preserve">     http_req_failed................: 0.00%   0 out of 101001</w:t>
-      </w:r>
-    </w:p>
-    <w:p>
-      <w:pPr>
-        <w:pBdr>
-          <w:left w:val="single" w:color="000000" w:sz="4" w:space="6"/>
-          <w:right w:val="single" w:color="000000" w:sz="4" w:space="6"/>
-        </w:pBdr>
-        <w:spacing w:after="0" w:line="228"/>
-        <w:ind w:left="140" w:right="140"/>
-      </w:pPr>
-      <w:r>
-        <w:rPr>
-          <w:rFonts w:ascii="Courier New" w:cs="Courier New" w:eastAsia="Courier New" w:hAnsi="Courier New"/>
-          <w:sz w:val="16"/>
-          <w:szCs w:val="16"/>
-        </w:rPr>
-        <w:t xml:space="preserve">     http_reqs......................: 101001  8040.23066/s</w:t>
+        <w:t xml:space="preserve">     http_reqs......................: 101004  8007.800803/s</w:t>
       </w:r>
     </w:p>
     <w:p>
@@ -19505,7 +19487,7 @@
           <w:sz w:val="16"/>
           <w:szCs w:val="16"/>
         </w:rPr>
-        <w:t xml:space="preserve">     vus_max........................: 1220    min=1220             max=1220</w:t>
+        <w:t xml:space="preserve">     vus_max........................: 120     min=120              max=120</w:t>
       </w:r>
     </w:p>
     <w:p>
@@ -19546,7 +19528,1216 @@
         <w:jc w:val="both"/>
       </w:pPr>
       <w:r>
-        <w:t xml:space="preserve">The ops-page screenshots in this section and in section 8.5 were taken during these load runs, before the final UI update that changed the accent colours from red and green to blue and lime. Only the colours differ from the current UI; the numbers shown are the ones recorded during the runs.</w:t>
+        <w:rPr>
+          <w:b/>
+          <w:bCs/>
+        </w:rPr>
+        <w:t xml:space="preserve">Requests in flight.</w:t>
+      </w:r>
+      <w:r>
+        <w:t xml:space="preserve"> The first version of this test used 1,200 virtual users, so 1,200 requests were in flight at all times. The machine can only complete about 11,000 requests per second, so the extra requests simply waited in line: median 55 ms, p95 191 ms, slowest 1.03 s, for the same 100,000 requests in 8.8 s. The same burst was repeated with fewer requests in flight. Throughput stayed the same and latency dropped sharply, so the test now uses 100 and its p95 threshold was tightened from 1 s to 100 ms. Every run below had exactly 500 orders, every request answered and no errors.</w:t>
+      </w:r>
+    </w:p>
+    <w:tbl>
+      <w:tblPr>
+        <w:tblW w:type="dxa" w:w="9026"/>
+        <w:tblBorders>
+          <w:top w:val="single" w:color="auto" w:sz="4"/>
+          <w:left w:val="single" w:color="auto" w:sz="4"/>
+          <w:bottom w:val="single" w:color="auto" w:sz="4"/>
+          <w:right w:val="single" w:color="auto" w:sz="4"/>
+          <w:insideH w:val="single" w:color="auto" w:sz="4"/>
+          <w:insideV w:val="single" w:color="auto" w:sz="4"/>
+        </w:tblBorders>
+      </w:tblPr>
+      <w:tblGrid>
+        <w:gridCol w:w="1905"/>
+        <w:gridCol w:w="1002"/>
+        <w:gridCol w:w="1002"/>
+        <w:gridCol w:w="1002"/>
+        <w:gridCol w:w="1404"/>
+        <w:gridCol w:w="2711"/>
+      </w:tblGrid>
+      <w:tr>
+        <w:trPr>
+          <w:cantSplit/>
+          <w:tblHeader/>
+        </w:trPr>
+        <w:tc>
+          <w:tcPr>
+            <w:tcW w:type="dxa" w:w="1905"/>
+            <w:tcBorders>
+              <w:top w:val="single" w:color="000000" w:sz="4"/>
+              <w:left w:val="single" w:color="000000" w:sz="4"/>
+              <w:bottom w:val="single" w:color="000000" w:sz="4"/>
+              <w:right w:val="single" w:color="000000" w:sz="4"/>
+            </w:tcBorders>
+            <w:shd w:fill="D9D9D9" w:color="auto" w:val="clear"/>
+            <w:tcMar>
+              <w:top w:type="dxa" w:w="50"/>
+              <w:left w:type="dxa" w:w="90"/>
+              <w:bottom w:type="dxa" w:w="50"/>
+              <w:right w:type="dxa" w:w="90"/>
+            </w:tcMar>
+          </w:tcPr>
+          <w:p>
+            <w:pPr>
+              <w:spacing w:after="0" w:line="240"/>
+            </w:pPr>
+            <w:r>
+              <w:rPr>
+                <w:b/>
+                <w:bCs/>
+                <w:sz w:val="18"/>
+                <w:szCs w:val="18"/>
+              </w:rPr>
+              <w:t xml:space="preserve">Requests in flight</w:t>
+            </w:r>
+          </w:p>
+        </w:tc>
+        <w:tc>
+          <w:tcPr>
+            <w:tcW w:type="dxa" w:w="1002"/>
+            <w:tcBorders>
+              <w:top w:val="single" w:color="000000" w:sz="4"/>
+              <w:left w:val="single" w:color="000000" w:sz="4"/>
+              <w:bottom w:val="single" w:color="000000" w:sz="4"/>
+              <w:right w:val="single" w:color="000000" w:sz="4"/>
+            </w:tcBorders>
+            <w:shd w:fill="D9D9D9" w:color="auto" w:val="clear"/>
+            <w:tcMar>
+              <w:top w:type="dxa" w:w="50"/>
+              <w:left w:type="dxa" w:w="90"/>
+              <w:bottom w:type="dxa" w:w="50"/>
+              <w:right w:type="dxa" w:w="90"/>
+            </w:tcMar>
+          </w:tcPr>
+          <w:p>
+            <w:pPr>
+              <w:spacing w:after="0" w:line="240"/>
+            </w:pPr>
+            <w:r>
+              <w:rPr>
+                <w:b/>
+                <w:bCs/>
+                <w:sz w:val="18"/>
+                <w:szCs w:val="18"/>
+              </w:rPr>
+              <w:t xml:space="preserve">Median</w:t>
+            </w:r>
+          </w:p>
+        </w:tc>
+        <w:tc>
+          <w:tcPr>
+            <w:tcW w:type="dxa" w:w="1002"/>
+            <w:tcBorders>
+              <w:top w:val="single" w:color="000000" w:sz="4"/>
+              <w:left w:val="single" w:color="000000" w:sz="4"/>
+              <w:bottom w:val="single" w:color="000000" w:sz="4"/>
+              <w:right w:val="single" w:color="000000" w:sz="4"/>
+            </w:tcBorders>
+            <w:shd w:fill="D9D9D9" w:color="auto" w:val="clear"/>
+            <w:tcMar>
+              <w:top w:type="dxa" w:w="50"/>
+              <w:left w:type="dxa" w:w="90"/>
+              <w:bottom w:type="dxa" w:w="50"/>
+              <w:right w:type="dxa" w:w="90"/>
+            </w:tcMar>
+          </w:tcPr>
+          <w:p>
+            <w:pPr>
+              <w:spacing w:after="0" w:line="240"/>
+            </w:pPr>
+            <w:r>
+              <w:rPr>
+                <w:b/>
+                <w:bCs/>
+                <w:sz w:val="18"/>
+                <w:szCs w:val="18"/>
+              </w:rPr>
+              <w:t xml:space="preserve">p90</w:t>
+            </w:r>
+          </w:p>
+        </w:tc>
+        <w:tc>
+          <w:tcPr>
+            <w:tcW w:type="dxa" w:w="1002"/>
+            <w:tcBorders>
+              <w:top w:val="single" w:color="000000" w:sz="4"/>
+              <w:left w:val="single" w:color="000000" w:sz="4"/>
+              <w:bottom w:val="single" w:color="000000" w:sz="4"/>
+              <w:right w:val="single" w:color="000000" w:sz="4"/>
+            </w:tcBorders>
+            <w:shd w:fill="D9D9D9" w:color="auto" w:val="clear"/>
+            <w:tcMar>
+              <w:top w:type="dxa" w:w="50"/>
+              <w:left w:type="dxa" w:w="90"/>
+              <w:bottom w:type="dxa" w:w="50"/>
+              <w:right w:type="dxa" w:w="90"/>
+            </w:tcMar>
+          </w:tcPr>
+          <w:p>
+            <w:pPr>
+              <w:spacing w:after="0" w:line="240"/>
+            </w:pPr>
+            <w:r>
+              <w:rPr>
+                <w:b/>
+                <w:bCs/>
+                <w:sz w:val="18"/>
+                <w:szCs w:val="18"/>
+              </w:rPr>
+              <w:t xml:space="preserve">p95</w:t>
+            </w:r>
+          </w:p>
+        </w:tc>
+        <w:tc>
+          <w:tcPr>
+            <w:tcW w:type="dxa" w:w="1404"/>
+            <w:tcBorders>
+              <w:top w:val="single" w:color="000000" w:sz="4"/>
+              <w:left w:val="single" w:color="000000" w:sz="4"/>
+              <w:bottom w:val="single" w:color="000000" w:sz="4"/>
+              <w:right w:val="single" w:color="000000" w:sz="4"/>
+            </w:tcBorders>
+            <w:shd w:fill="D9D9D9" w:color="auto" w:val="clear"/>
+            <w:tcMar>
+              <w:top w:type="dxa" w:w="50"/>
+              <w:left w:type="dxa" w:w="90"/>
+              <w:bottom w:type="dxa" w:w="50"/>
+              <w:right w:type="dxa" w:w="90"/>
+            </w:tcMar>
+          </w:tcPr>
+          <w:p>
+            <w:pPr>
+              <w:spacing w:after="0" w:line="240"/>
+            </w:pPr>
+            <w:r>
+              <w:rPr>
+                <w:b/>
+                <w:bCs/>
+                <w:sz w:val="18"/>
+                <w:szCs w:val="18"/>
+              </w:rPr>
+              <w:t xml:space="preserve">Slowest request</w:t>
+            </w:r>
+          </w:p>
+        </w:tc>
+        <w:tc>
+          <w:tcPr>
+            <w:tcW w:type="dxa" w:w="2711"/>
+            <w:tcBorders>
+              <w:top w:val="single" w:color="000000" w:sz="4"/>
+              <w:left w:val="single" w:color="000000" w:sz="4"/>
+              <w:bottom w:val="single" w:color="000000" w:sz="4"/>
+              <w:right w:val="single" w:color="000000" w:sz="4"/>
+            </w:tcBorders>
+            <w:shd w:fill="D9D9D9" w:color="auto" w:val="clear"/>
+            <w:tcMar>
+              <w:top w:type="dxa" w:w="50"/>
+              <w:left w:type="dxa" w:w="90"/>
+              <w:bottom w:type="dxa" w:w="50"/>
+              <w:right w:type="dxa" w:w="90"/>
+            </w:tcMar>
+          </w:tcPr>
+          <w:p>
+            <w:pPr>
+              <w:spacing w:after="0" w:line="240"/>
+            </w:pPr>
+            <w:r>
+              <w:rPr>
+                <w:b/>
+                <w:bCs/>
+                <w:sz w:val="18"/>
+                <w:szCs w:val="18"/>
+              </w:rPr>
+              <w:t xml:space="preserve">Evidence file (evidence/k6/)</w:t>
+            </w:r>
+          </w:p>
+        </w:tc>
+      </w:tr>
+      <w:tr>
+        <w:trPr>
+          <w:cantSplit/>
+          <w:tblHeader w:val="off"/>
+        </w:trPr>
+        <w:tc>
+          <w:tcPr>
+            <w:tcW w:type="dxa" w:w="1905"/>
+            <w:tcBorders>
+              <w:top w:val="single" w:color="000000" w:sz="4"/>
+              <w:left w:val="single" w:color="000000" w:sz="4"/>
+              <w:bottom w:val="single" w:color="000000" w:sz="4"/>
+              <w:right w:val="single" w:color="000000" w:sz="4"/>
+            </w:tcBorders>
+            <w:tcMar>
+              <w:top w:type="dxa" w:w="50"/>
+              <w:left w:type="dxa" w:w="90"/>
+              <w:bottom w:type="dxa" w:w="50"/>
+              <w:right w:type="dxa" w:w="90"/>
+            </w:tcMar>
+          </w:tcPr>
+          <w:p>
+            <w:pPr>
+              <w:spacing w:after="0" w:line="240"/>
+            </w:pPr>
+            <w:r>
+              <w:rPr>
+                <w:b w:val="false"/>
+                <w:bCs w:val="false"/>
+                <w:sz w:val="18"/>
+                <w:szCs w:val="18"/>
+              </w:rPr>
+              <w:t xml:space="preserve">1,200</w:t>
+            </w:r>
+          </w:p>
+        </w:tc>
+        <w:tc>
+          <w:tcPr>
+            <w:tcW w:type="dxa" w:w="1002"/>
+            <w:tcBorders>
+              <w:top w:val="single" w:color="000000" w:sz="4"/>
+              <w:left w:val="single" w:color="000000" w:sz="4"/>
+              <w:bottom w:val="single" w:color="000000" w:sz="4"/>
+              <w:right w:val="single" w:color="000000" w:sz="4"/>
+            </w:tcBorders>
+            <w:tcMar>
+              <w:top w:type="dxa" w:w="50"/>
+              <w:left w:type="dxa" w:w="90"/>
+              <w:bottom w:type="dxa" w:w="50"/>
+              <w:right w:type="dxa" w:w="90"/>
+            </w:tcMar>
+          </w:tcPr>
+          <w:p>
+            <w:pPr>
+              <w:spacing w:after="0" w:line="240"/>
+            </w:pPr>
+            <w:r>
+              <w:rPr>
+                <w:b w:val="false"/>
+                <w:bCs w:val="false"/>
+                <w:sz w:val="18"/>
+                <w:szCs w:val="18"/>
+              </w:rPr>
+              <w:t xml:space="preserve">55.6 ms</w:t>
+            </w:r>
+          </w:p>
+        </w:tc>
+        <w:tc>
+          <w:tcPr>
+            <w:tcW w:type="dxa" w:w="1002"/>
+            <w:tcBorders>
+              <w:top w:val="single" w:color="000000" w:sz="4"/>
+              <w:left w:val="single" w:color="000000" w:sz="4"/>
+              <w:bottom w:val="single" w:color="000000" w:sz="4"/>
+              <w:right w:val="single" w:color="000000" w:sz="4"/>
+            </w:tcBorders>
+            <w:tcMar>
+              <w:top w:type="dxa" w:w="50"/>
+              <w:left w:type="dxa" w:w="90"/>
+              <w:bottom w:type="dxa" w:w="50"/>
+              <w:right w:type="dxa" w:w="90"/>
+            </w:tcMar>
+          </w:tcPr>
+          <w:p>
+            <w:pPr>
+              <w:spacing w:after="0" w:line="240"/>
+            </w:pPr>
+            <w:r>
+              <w:rPr>
+                <w:b w:val="false"/>
+                <w:bCs w:val="false"/>
+                <w:sz w:val="18"/>
+                <w:szCs w:val="18"/>
+              </w:rPr>
+              <w:t xml:space="preserve">144.9 ms</w:t>
+            </w:r>
+          </w:p>
+        </w:tc>
+        <w:tc>
+          <w:tcPr>
+            <w:tcW w:type="dxa" w:w="1002"/>
+            <w:tcBorders>
+              <w:top w:val="single" w:color="000000" w:sz="4"/>
+              <w:left w:val="single" w:color="000000" w:sz="4"/>
+              <w:bottom w:val="single" w:color="000000" w:sz="4"/>
+              <w:right w:val="single" w:color="000000" w:sz="4"/>
+            </w:tcBorders>
+            <w:tcMar>
+              <w:top w:type="dxa" w:w="50"/>
+              <w:left w:type="dxa" w:w="90"/>
+              <w:bottom w:type="dxa" w:w="50"/>
+              <w:right w:type="dxa" w:w="90"/>
+            </w:tcMar>
+          </w:tcPr>
+          <w:p>
+            <w:pPr>
+              <w:spacing w:after="0" w:line="240"/>
+            </w:pPr>
+            <w:r>
+              <w:rPr>
+                <w:b w:val="false"/>
+                <w:bCs w:val="false"/>
+                <w:sz w:val="18"/>
+                <w:szCs w:val="18"/>
+              </w:rPr>
+              <w:t xml:space="preserve">191.6 ms</w:t>
+            </w:r>
+          </w:p>
+        </w:tc>
+        <w:tc>
+          <w:tcPr>
+            <w:tcW w:type="dxa" w:w="1404"/>
+            <w:tcBorders>
+              <w:top w:val="single" w:color="000000" w:sz="4"/>
+              <w:left w:val="single" w:color="000000" w:sz="4"/>
+              <w:bottom w:val="single" w:color="000000" w:sz="4"/>
+              <w:right w:val="single" w:color="000000" w:sz="4"/>
+            </w:tcBorders>
+            <w:tcMar>
+              <w:top w:type="dxa" w:w="50"/>
+              <w:left w:type="dxa" w:w="90"/>
+              <w:bottom w:type="dxa" w:w="50"/>
+              <w:right w:type="dxa" w:w="90"/>
+            </w:tcMar>
+          </w:tcPr>
+          <w:p>
+            <w:pPr>
+              <w:spacing w:after="0" w:line="240"/>
+            </w:pPr>
+            <w:r>
+              <w:rPr>
+                <w:b w:val="false"/>
+                <w:bCs w:val="false"/>
+                <w:sz w:val="18"/>
+                <w:szCs w:val="18"/>
+              </w:rPr>
+              <w:t xml:space="preserve">1,028 ms</w:t>
+            </w:r>
+          </w:p>
+        </w:tc>
+        <w:tc>
+          <w:tcPr>
+            <w:tcW w:type="dxa" w:w="2711"/>
+            <w:tcBorders>
+              <w:top w:val="single" w:color="000000" w:sz="4"/>
+              <w:left w:val="single" w:color="000000" w:sz="4"/>
+              <w:bottom w:val="single" w:color="000000" w:sz="4"/>
+              <w:right w:val="single" w:color="000000" w:sz="4"/>
+            </w:tcBorders>
+            <w:tcMar>
+              <w:top w:type="dxa" w:w="50"/>
+              <w:left w:type="dxa" w:w="90"/>
+              <w:bottom w:type="dxa" w:w="50"/>
+              <w:right w:type="dxa" w:w="90"/>
+            </w:tcMar>
+          </w:tcPr>
+          <w:p>
+            <w:pPr>
+              <w:spacing w:after="0" w:line="240"/>
+            </w:pPr>
+            <w:r>
+              <w:rPr>
+                <w:b w:val="false"/>
+                <w:bCs w:val="false"/>
+                <w:sz w:val="18"/>
+                <w:szCs w:val="18"/>
+              </w:rPr>
+              <w:t xml:space="preserve">flash-sale-summary-1200vus.json</w:t>
+            </w:r>
+          </w:p>
+        </w:tc>
+      </w:tr>
+      <w:tr>
+        <w:trPr>
+          <w:cantSplit/>
+          <w:tblHeader w:val="off"/>
+        </w:trPr>
+        <w:tc>
+          <w:tcPr>
+            <w:tcW w:type="dxa" w:w="1905"/>
+            <w:tcBorders>
+              <w:top w:val="single" w:color="000000" w:sz="4"/>
+              <w:left w:val="single" w:color="000000" w:sz="4"/>
+              <w:bottom w:val="single" w:color="000000" w:sz="4"/>
+              <w:right w:val="single" w:color="000000" w:sz="4"/>
+            </w:tcBorders>
+            <w:tcMar>
+              <w:top w:type="dxa" w:w="50"/>
+              <w:left w:type="dxa" w:w="90"/>
+              <w:bottom w:type="dxa" w:w="50"/>
+              <w:right w:type="dxa" w:w="90"/>
+            </w:tcMar>
+          </w:tcPr>
+          <w:p>
+            <w:pPr>
+              <w:spacing w:after="0" w:line="240"/>
+            </w:pPr>
+            <w:r>
+              <w:rPr>
+                <w:b w:val="false"/>
+                <w:bCs w:val="false"/>
+                <w:sz w:val="18"/>
+                <w:szCs w:val="18"/>
+              </w:rPr>
+              <w:t xml:space="preserve">400</w:t>
+            </w:r>
+          </w:p>
+        </w:tc>
+        <w:tc>
+          <w:tcPr>
+            <w:tcW w:type="dxa" w:w="1002"/>
+            <w:tcBorders>
+              <w:top w:val="single" w:color="000000" w:sz="4"/>
+              <w:left w:val="single" w:color="000000" w:sz="4"/>
+              <w:bottom w:val="single" w:color="000000" w:sz="4"/>
+              <w:right w:val="single" w:color="000000" w:sz="4"/>
+            </w:tcBorders>
+            <w:tcMar>
+              <w:top w:type="dxa" w:w="50"/>
+              <w:left w:type="dxa" w:w="90"/>
+              <w:bottom w:type="dxa" w:w="50"/>
+              <w:right w:type="dxa" w:w="90"/>
+            </w:tcMar>
+          </w:tcPr>
+          <w:p>
+            <w:pPr>
+              <w:spacing w:after="0" w:line="240"/>
+            </w:pPr>
+            <w:r>
+              <w:rPr>
+                <w:b w:val="false"/>
+                <w:bCs w:val="false"/>
+                <w:sz w:val="18"/>
+                <w:szCs w:val="18"/>
+              </w:rPr>
+              <w:t xml:space="preserve">28.8 ms</w:t>
+            </w:r>
+          </w:p>
+        </w:tc>
+        <w:tc>
+          <w:tcPr>
+            <w:tcW w:type="dxa" w:w="1002"/>
+            <w:tcBorders>
+              <w:top w:val="single" w:color="000000" w:sz="4"/>
+              <w:left w:val="single" w:color="000000" w:sz="4"/>
+              <w:bottom w:val="single" w:color="000000" w:sz="4"/>
+              <w:right w:val="single" w:color="000000" w:sz="4"/>
+            </w:tcBorders>
+            <w:tcMar>
+              <w:top w:type="dxa" w:w="50"/>
+              <w:left w:type="dxa" w:w="90"/>
+              <w:bottom w:type="dxa" w:w="50"/>
+              <w:right w:type="dxa" w:w="90"/>
+            </w:tcMar>
+          </w:tcPr>
+          <w:p>
+            <w:pPr>
+              <w:spacing w:after="0" w:line="240"/>
+            </w:pPr>
+            <w:r>
+              <w:rPr>
+                <w:b w:val="false"/>
+                <w:bCs w:val="false"/>
+                <w:sz w:val="18"/>
+                <w:szCs w:val="18"/>
+              </w:rPr>
+              <w:t xml:space="preserve">96.5 ms</w:t>
+            </w:r>
+          </w:p>
+        </w:tc>
+        <w:tc>
+          <w:tcPr>
+            <w:tcW w:type="dxa" w:w="1002"/>
+            <w:tcBorders>
+              <w:top w:val="single" w:color="000000" w:sz="4"/>
+              <w:left w:val="single" w:color="000000" w:sz="4"/>
+              <w:bottom w:val="single" w:color="000000" w:sz="4"/>
+              <w:right w:val="single" w:color="000000" w:sz="4"/>
+            </w:tcBorders>
+            <w:tcMar>
+              <w:top w:type="dxa" w:w="50"/>
+              <w:left w:type="dxa" w:w="90"/>
+              <w:bottom w:type="dxa" w:w="50"/>
+              <w:right w:type="dxa" w:w="90"/>
+            </w:tcMar>
+          </w:tcPr>
+          <w:p>
+            <w:pPr>
+              <w:spacing w:after="0" w:line="240"/>
+            </w:pPr>
+            <w:r>
+              <w:rPr>
+                <w:b w:val="false"/>
+                <w:bCs w:val="false"/>
+                <w:sz w:val="18"/>
+                <w:szCs w:val="18"/>
+              </w:rPr>
+              <w:t xml:space="preserve">139.4 ms</w:t>
+            </w:r>
+          </w:p>
+        </w:tc>
+        <w:tc>
+          <w:tcPr>
+            <w:tcW w:type="dxa" w:w="1404"/>
+            <w:tcBorders>
+              <w:top w:val="single" w:color="000000" w:sz="4"/>
+              <w:left w:val="single" w:color="000000" w:sz="4"/>
+              <w:bottom w:val="single" w:color="000000" w:sz="4"/>
+              <w:right w:val="single" w:color="000000" w:sz="4"/>
+            </w:tcBorders>
+            <w:tcMar>
+              <w:top w:type="dxa" w:w="50"/>
+              <w:left w:type="dxa" w:w="90"/>
+              <w:bottom w:type="dxa" w:w="50"/>
+              <w:right w:type="dxa" w:w="90"/>
+            </w:tcMar>
+          </w:tcPr>
+          <w:p>
+            <w:pPr>
+              <w:spacing w:after="0" w:line="240"/>
+            </w:pPr>
+            <w:r>
+              <w:rPr>
+                <w:b w:val="false"/>
+                <w:bCs w:val="false"/>
+                <w:sz w:val="18"/>
+                <w:szCs w:val="18"/>
+              </w:rPr>
+              <w:t xml:space="preserve">2,188 ms</w:t>
+            </w:r>
+          </w:p>
+        </w:tc>
+        <w:tc>
+          <w:tcPr>
+            <w:tcW w:type="dxa" w:w="2711"/>
+            <w:tcBorders>
+              <w:top w:val="single" w:color="000000" w:sz="4"/>
+              <w:left w:val="single" w:color="000000" w:sz="4"/>
+              <w:bottom w:val="single" w:color="000000" w:sz="4"/>
+              <w:right w:val="single" w:color="000000" w:sz="4"/>
+            </w:tcBorders>
+            <w:tcMar>
+              <w:top w:type="dxa" w:w="50"/>
+              <w:left w:type="dxa" w:w="90"/>
+              <w:bottom w:type="dxa" w:w="50"/>
+              <w:right w:type="dxa" w:w="90"/>
+            </w:tcMar>
+          </w:tcPr>
+          <w:p>
+            <w:pPr>
+              <w:spacing w:after="0" w:line="240"/>
+            </w:pPr>
+            <w:r>
+              <w:rPr>
+                <w:b w:val="false"/>
+                <w:bCs w:val="false"/>
+                <w:sz w:val="18"/>
+                <w:szCs w:val="18"/>
+              </w:rPr>
+              <w:t xml:space="preserve">tuning-vus400-summary.json</w:t>
+            </w:r>
+          </w:p>
+        </w:tc>
+      </w:tr>
+      <w:tr>
+        <w:trPr>
+          <w:cantSplit/>
+          <w:tblHeader w:val="off"/>
+        </w:trPr>
+        <w:tc>
+          <w:tcPr>
+            <w:tcW w:type="dxa" w:w="1905"/>
+            <w:tcBorders>
+              <w:top w:val="single" w:color="000000" w:sz="4"/>
+              <w:left w:val="single" w:color="000000" w:sz="4"/>
+              <w:bottom w:val="single" w:color="000000" w:sz="4"/>
+              <w:right w:val="single" w:color="000000" w:sz="4"/>
+            </w:tcBorders>
+            <w:tcMar>
+              <w:top w:type="dxa" w:w="50"/>
+              <w:left w:type="dxa" w:w="90"/>
+              <w:bottom w:type="dxa" w:w="50"/>
+              <w:right w:type="dxa" w:w="90"/>
+            </w:tcMar>
+          </w:tcPr>
+          <w:p>
+            <w:pPr>
+              <w:spacing w:after="0" w:line="240"/>
+            </w:pPr>
+            <w:r>
+              <w:rPr>
+                <w:b w:val="false"/>
+                <w:bCs w:val="false"/>
+                <w:sz w:val="18"/>
+                <w:szCs w:val="18"/>
+              </w:rPr>
+              <w:t xml:space="preserve">200</w:t>
+            </w:r>
+          </w:p>
+        </w:tc>
+        <w:tc>
+          <w:tcPr>
+            <w:tcW w:type="dxa" w:w="1002"/>
+            <w:tcBorders>
+              <w:top w:val="single" w:color="000000" w:sz="4"/>
+              <w:left w:val="single" w:color="000000" w:sz="4"/>
+              <w:bottom w:val="single" w:color="000000" w:sz="4"/>
+              <w:right w:val="single" w:color="000000" w:sz="4"/>
+            </w:tcBorders>
+            <w:tcMar>
+              <w:top w:type="dxa" w:w="50"/>
+              <w:left w:type="dxa" w:w="90"/>
+              <w:bottom w:type="dxa" w:w="50"/>
+              <w:right w:type="dxa" w:w="90"/>
+            </w:tcMar>
+          </w:tcPr>
+          <w:p>
+            <w:pPr>
+              <w:spacing w:after="0" w:line="240"/>
+            </w:pPr>
+            <w:r>
+              <w:rPr>
+                <w:b w:val="false"/>
+                <w:bCs w:val="false"/>
+                <w:sz w:val="18"/>
+                <w:szCs w:val="18"/>
+              </w:rPr>
+              <w:t xml:space="preserve">9.4 ms</w:t>
+            </w:r>
+          </w:p>
+        </w:tc>
+        <w:tc>
+          <w:tcPr>
+            <w:tcW w:type="dxa" w:w="1002"/>
+            <w:tcBorders>
+              <w:top w:val="single" w:color="000000" w:sz="4"/>
+              <w:left w:val="single" w:color="000000" w:sz="4"/>
+              <w:bottom w:val="single" w:color="000000" w:sz="4"/>
+              <w:right w:val="single" w:color="000000" w:sz="4"/>
+            </w:tcBorders>
+            <w:tcMar>
+              <w:top w:type="dxa" w:w="50"/>
+              <w:left w:type="dxa" w:w="90"/>
+              <w:bottom w:type="dxa" w:w="50"/>
+              <w:right w:type="dxa" w:w="90"/>
+            </w:tcMar>
+          </w:tcPr>
+          <w:p>
+            <w:pPr>
+              <w:spacing w:after="0" w:line="240"/>
+            </w:pPr>
+            <w:r>
+              <w:rPr>
+                <w:b w:val="false"/>
+                <w:bCs w:val="false"/>
+                <w:sz w:val="18"/>
+                <w:szCs w:val="18"/>
+              </w:rPr>
+              <w:t xml:space="preserve">28.2 ms</w:t>
+            </w:r>
+          </w:p>
+        </w:tc>
+        <w:tc>
+          <w:tcPr>
+            <w:tcW w:type="dxa" w:w="1002"/>
+            <w:tcBorders>
+              <w:top w:val="single" w:color="000000" w:sz="4"/>
+              <w:left w:val="single" w:color="000000" w:sz="4"/>
+              <w:bottom w:val="single" w:color="000000" w:sz="4"/>
+              <w:right w:val="single" w:color="000000" w:sz="4"/>
+            </w:tcBorders>
+            <w:tcMar>
+              <w:top w:type="dxa" w:w="50"/>
+              <w:left w:type="dxa" w:w="90"/>
+              <w:bottom w:type="dxa" w:w="50"/>
+              <w:right w:type="dxa" w:w="90"/>
+            </w:tcMar>
+          </w:tcPr>
+          <w:p>
+            <w:pPr>
+              <w:spacing w:after="0" w:line="240"/>
+            </w:pPr>
+            <w:r>
+              <w:rPr>
+                <w:b w:val="false"/>
+                <w:bCs w:val="false"/>
+                <w:sz w:val="18"/>
+                <w:szCs w:val="18"/>
+              </w:rPr>
+              <w:t xml:space="preserve">36.6 ms</w:t>
+            </w:r>
+          </w:p>
+        </w:tc>
+        <w:tc>
+          <w:tcPr>
+            <w:tcW w:type="dxa" w:w="1404"/>
+            <w:tcBorders>
+              <w:top w:val="single" w:color="000000" w:sz="4"/>
+              <w:left w:val="single" w:color="000000" w:sz="4"/>
+              <w:bottom w:val="single" w:color="000000" w:sz="4"/>
+              <w:right w:val="single" w:color="000000" w:sz="4"/>
+            </w:tcBorders>
+            <w:tcMar>
+              <w:top w:type="dxa" w:w="50"/>
+              <w:left w:type="dxa" w:w="90"/>
+              <w:bottom w:type="dxa" w:w="50"/>
+              <w:right w:type="dxa" w:w="90"/>
+            </w:tcMar>
+          </w:tcPr>
+          <w:p>
+            <w:pPr>
+              <w:spacing w:after="0" w:line="240"/>
+            </w:pPr>
+            <w:r>
+              <w:rPr>
+                <w:b w:val="false"/>
+                <w:bCs w:val="false"/>
+                <w:sz w:val="18"/>
+                <w:szCs w:val="18"/>
+              </w:rPr>
+              <w:t xml:space="preserve">194 ms</w:t>
+            </w:r>
+          </w:p>
+        </w:tc>
+        <w:tc>
+          <w:tcPr>
+            <w:tcW w:type="dxa" w:w="2711"/>
+            <w:tcBorders>
+              <w:top w:val="single" w:color="000000" w:sz="4"/>
+              <w:left w:val="single" w:color="000000" w:sz="4"/>
+              <w:bottom w:val="single" w:color="000000" w:sz="4"/>
+              <w:right w:val="single" w:color="000000" w:sz="4"/>
+            </w:tcBorders>
+            <w:tcMar>
+              <w:top w:type="dxa" w:w="50"/>
+              <w:left w:type="dxa" w:w="90"/>
+              <w:bottom w:type="dxa" w:w="50"/>
+              <w:right w:type="dxa" w:w="90"/>
+            </w:tcMar>
+          </w:tcPr>
+          <w:p>
+            <w:pPr>
+              <w:spacing w:after="0" w:line="240"/>
+            </w:pPr>
+            <w:r>
+              <w:rPr>
+                <w:b w:val="false"/>
+                <w:bCs w:val="false"/>
+                <w:sz w:val="18"/>
+                <w:szCs w:val="18"/>
+              </w:rPr>
+              <w:t xml:space="preserve">tuning-vus200-summary.json</w:t>
+            </w:r>
+          </w:p>
+        </w:tc>
+      </w:tr>
+      <w:tr>
+        <w:trPr>
+          <w:cantSplit/>
+          <w:tblHeader w:val="off"/>
+        </w:trPr>
+        <w:tc>
+          <w:tcPr>
+            <w:tcW w:type="dxa" w:w="1905"/>
+            <w:tcBorders>
+              <w:top w:val="single" w:color="000000" w:sz="4"/>
+              <w:left w:val="single" w:color="000000" w:sz="4"/>
+              <w:bottom w:val="single" w:color="000000" w:sz="4"/>
+              <w:right w:val="single" w:color="000000" w:sz="4"/>
+            </w:tcBorders>
+            <w:tcMar>
+              <w:top w:type="dxa" w:w="50"/>
+              <w:left w:type="dxa" w:w="90"/>
+              <w:bottom w:type="dxa" w:w="50"/>
+              <w:right w:type="dxa" w:w="90"/>
+            </w:tcMar>
+          </w:tcPr>
+          <w:p>
+            <w:pPr>
+              <w:spacing w:after="0" w:line="240"/>
+            </w:pPr>
+            <w:r>
+              <w:rPr>
+                <w:b w:val="false"/>
+                <w:bCs w:val="false"/>
+                <w:sz w:val="18"/>
+                <w:szCs w:val="18"/>
+              </w:rPr>
+              <w:t xml:space="preserve">100</w:t>
+            </w:r>
+          </w:p>
+        </w:tc>
+        <w:tc>
+          <w:tcPr>
+            <w:tcW w:type="dxa" w:w="1002"/>
+            <w:tcBorders>
+              <w:top w:val="single" w:color="000000" w:sz="4"/>
+              <w:left w:val="single" w:color="000000" w:sz="4"/>
+              <w:bottom w:val="single" w:color="000000" w:sz="4"/>
+              <w:right w:val="single" w:color="000000" w:sz="4"/>
+            </w:tcBorders>
+            <w:tcMar>
+              <w:top w:type="dxa" w:w="50"/>
+              <w:left w:type="dxa" w:w="90"/>
+              <w:bottom w:type="dxa" w:w="50"/>
+              <w:right w:type="dxa" w:w="90"/>
+            </w:tcMar>
+          </w:tcPr>
+          <w:p>
+            <w:pPr>
+              <w:spacing w:after="0" w:line="240"/>
+            </w:pPr>
+            <w:r>
+              <w:rPr>
+                <w:b w:val="false"/>
+                <w:bCs w:val="false"/>
+                <w:sz w:val="18"/>
+                <w:szCs w:val="18"/>
+              </w:rPr>
+              <w:t xml:space="preserve">5.0 ms</w:t>
+            </w:r>
+          </w:p>
+        </w:tc>
+        <w:tc>
+          <w:tcPr>
+            <w:tcW w:type="dxa" w:w="1002"/>
+            <w:tcBorders>
+              <w:top w:val="single" w:color="000000" w:sz="4"/>
+              <w:left w:val="single" w:color="000000" w:sz="4"/>
+              <w:bottom w:val="single" w:color="000000" w:sz="4"/>
+              <w:right w:val="single" w:color="000000" w:sz="4"/>
+            </w:tcBorders>
+            <w:tcMar>
+              <w:top w:type="dxa" w:w="50"/>
+              <w:left w:type="dxa" w:w="90"/>
+              <w:bottom w:type="dxa" w:w="50"/>
+              <w:right w:type="dxa" w:w="90"/>
+            </w:tcMar>
+          </w:tcPr>
+          <w:p>
+            <w:pPr>
+              <w:spacing w:after="0" w:line="240"/>
+            </w:pPr>
+            <w:r>
+              <w:rPr>
+                <w:b w:val="false"/>
+                <w:bCs w:val="false"/>
+                <w:sz w:val="18"/>
+                <w:szCs w:val="18"/>
+              </w:rPr>
+              <w:t xml:space="preserve">14.7 ms</w:t>
+            </w:r>
+          </w:p>
+        </w:tc>
+        <w:tc>
+          <w:tcPr>
+            <w:tcW w:type="dxa" w:w="1002"/>
+            <w:tcBorders>
+              <w:top w:val="single" w:color="000000" w:sz="4"/>
+              <w:left w:val="single" w:color="000000" w:sz="4"/>
+              <w:bottom w:val="single" w:color="000000" w:sz="4"/>
+              <w:right w:val="single" w:color="000000" w:sz="4"/>
+            </w:tcBorders>
+            <w:tcMar>
+              <w:top w:type="dxa" w:w="50"/>
+              <w:left w:type="dxa" w:w="90"/>
+              <w:bottom w:type="dxa" w:w="50"/>
+              <w:right w:type="dxa" w:w="90"/>
+            </w:tcMar>
+          </w:tcPr>
+          <w:p>
+            <w:pPr>
+              <w:spacing w:after="0" w:line="240"/>
+            </w:pPr>
+            <w:r>
+              <w:rPr>
+                <w:b w:val="false"/>
+                <w:bCs w:val="false"/>
+                <w:sz w:val="18"/>
+                <w:szCs w:val="18"/>
+              </w:rPr>
+              <w:t xml:space="preserve">19.2 ms</w:t>
+            </w:r>
+          </w:p>
+        </w:tc>
+        <w:tc>
+          <w:tcPr>
+            <w:tcW w:type="dxa" w:w="1404"/>
+            <w:tcBorders>
+              <w:top w:val="single" w:color="000000" w:sz="4"/>
+              <w:left w:val="single" w:color="000000" w:sz="4"/>
+              <w:bottom w:val="single" w:color="000000" w:sz="4"/>
+              <w:right w:val="single" w:color="000000" w:sz="4"/>
+            </w:tcBorders>
+            <w:tcMar>
+              <w:top w:type="dxa" w:w="50"/>
+              <w:left w:type="dxa" w:w="90"/>
+              <w:bottom w:type="dxa" w:w="50"/>
+              <w:right w:type="dxa" w:w="90"/>
+            </w:tcMar>
+          </w:tcPr>
+          <w:p>
+            <w:pPr>
+              <w:spacing w:after="0" w:line="240"/>
+            </w:pPr>
+            <w:r>
+              <w:rPr>
+                <w:b w:val="false"/>
+                <w:bCs w:val="false"/>
+                <w:sz w:val="18"/>
+                <w:szCs w:val="18"/>
+              </w:rPr>
+              <w:t xml:space="preserve">112 ms</w:t>
+            </w:r>
+          </w:p>
+        </w:tc>
+        <w:tc>
+          <w:tcPr>
+            <w:tcW w:type="dxa" w:w="2711"/>
+            <w:tcBorders>
+              <w:top w:val="single" w:color="000000" w:sz="4"/>
+              <w:left w:val="single" w:color="000000" w:sz="4"/>
+              <w:bottom w:val="single" w:color="000000" w:sz="4"/>
+              <w:right w:val="single" w:color="000000" w:sz="4"/>
+            </w:tcBorders>
+            <w:tcMar>
+              <w:top w:type="dxa" w:w="50"/>
+              <w:left w:type="dxa" w:w="90"/>
+              <w:bottom w:type="dxa" w:w="50"/>
+              <w:right w:type="dxa" w:w="90"/>
+            </w:tcMar>
+          </w:tcPr>
+          <w:p>
+            <w:pPr>
+              <w:spacing w:after="0" w:line="240"/>
+            </w:pPr>
+            <w:r>
+              <w:rPr>
+                <w:b w:val="false"/>
+                <w:bCs w:val="false"/>
+                <w:sz w:val="18"/>
+                <w:szCs w:val="18"/>
+              </w:rPr>
+              <w:t xml:space="preserve">tuning-vus100-summary.json</w:t>
+            </w:r>
+          </w:p>
+        </w:tc>
+      </w:tr>
+      <w:tr>
+        <w:trPr>
+          <w:cantSplit/>
+          <w:tblHeader w:val="off"/>
+        </w:trPr>
+        <w:tc>
+          <w:tcPr>
+            <w:tcW w:type="dxa" w:w="1905"/>
+            <w:tcBorders>
+              <w:top w:val="single" w:color="000000" w:sz="4"/>
+              <w:left w:val="single" w:color="000000" w:sz="4"/>
+              <w:bottom w:val="single" w:color="000000" w:sz="4"/>
+              <w:right w:val="single" w:color="000000" w:sz="4"/>
+            </w:tcBorders>
+            <w:tcMar>
+              <w:top w:type="dxa" w:w="50"/>
+              <w:left w:type="dxa" w:w="90"/>
+              <w:bottom w:type="dxa" w:w="50"/>
+              <w:right w:type="dxa" w:w="90"/>
+            </w:tcMar>
+          </w:tcPr>
+          <w:p>
+            <w:pPr>
+              <w:spacing w:after="0" w:line="240"/>
+            </w:pPr>
+            <w:r>
+              <w:rPr>
+                <w:b w:val="false"/>
+                <w:bCs w:val="false"/>
+                <w:sz w:val="18"/>
+                <w:szCs w:val="18"/>
+              </w:rPr>
+              <w:t xml:space="preserve">100 (official run above)</w:t>
+            </w:r>
+          </w:p>
+        </w:tc>
+        <w:tc>
+          <w:tcPr>
+            <w:tcW w:type="dxa" w:w="1002"/>
+            <w:tcBorders>
+              <w:top w:val="single" w:color="000000" w:sz="4"/>
+              <w:left w:val="single" w:color="000000" w:sz="4"/>
+              <w:bottom w:val="single" w:color="000000" w:sz="4"/>
+              <w:right w:val="single" w:color="000000" w:sz="4"/>
+            </w:tcBorders>
+            <w:tcMar>
+              <w:top w:type="dxa" w:w="50"/>
+              <w:left w:type="dxa" w:w="90"/>
+              <w:bottom w:type="dxa" w:w="50"/>
+              <w:right w:type="dxa" w:w="90"/>
+            </w:tcMar>
+          </w:tcPr>
+          <w:p>
+            <w:pPr>
+              <w:spacing w:after="0" w:line="240"/>
+            </w:pPr>
+            <w:r>
+              <w:rPr>
+                <w:b w:val="false"/>
+                <w:bCs w:val="false"/>
+                <w:sz w:val="18"/>
+                <w:szCs w:val="18"/>
+              </w:rPr>
+              <w:t xml:space="preserve">5.7 ms</w:t>
+            </w:r>
+          </w:p>
+        </w:tc>
+        <w:tc>
+          <w:tcPr>
+            <w:tcW w:type="dxa" w:w="1002"/>
+            <w:tcBorders>
+              <w:top w:val="single" w:color="000000" w:sz="4"/>
+              <w:left w:val="single" w:color="000000" w:sz="4"/>
+              <w:bottom w:val="single" w:color="000000" w:sz="4"/>
+              <w:right w:val="single" w:color="000000" w:sz="4"/>
+            </w:tcBorders>
+            <w:tcMar>
+              <w:top w:type="dxa" w:w="50"/>
+              <w:left w:type="dxa" w:w="90"/>
+              <w:bottom w:type="dxa" w:w="50"/>
+              <w:right w:type="dxa" w:w="90"/>
+            </w:tcMar>
+          </w:tcPr>
+          <w:p>
+            <w:pPr>
+              <w:spacing w:after="0" w:line="240"/>
+            </w:pPr>
+            <w:r>
+              <w:rPr>
+                <w:b w:val="false"/>
+                <w:bCs w:val="false"/>
+                <w:sz w:val="18"/>
+                <w:szCs w:val="18"/>
+              </w:rPr>
+              <w:t xml:space="preserve">17.8 ms</w:t>
+            </w:r>
+          </w:p>
+        </w:tc>
+        <w:tc>
+          <w:tcPr>
+            <w:tcW w:type="dxa" w:w="1002"/>
+            <w:tcBorders>
+              <w:top w:val="single" w:color="000000" w:sz="4"/>
+              <w:left w:val="single" w:color="000000" w:sz="4"/>
+              <w:bottom w:val="single" w:color="000000" w:sz="4"/>
+              <w:right w:val="single" w:color="000000" w:sz="4"/>
+            </w:tcBorders>
+            <w:tcMar>
+              <w:top w:type="dxa" w:w="50"/>
+              <w:left w:type="dxa" w:w="90"/>
+              <w:bottom w:type="dxa" w:w="50"/>
+              <w:right w:type="dxa" w:w="90"/>
+            </w:tcMar>
+          </w:tcPr>
+          <w:p>
+            <w:pPr>
+              <w:spacing w:after="0" w:line="240"/>
+            </w:pPr>
+            <w:r>
+              <w:rPr>
+                <w:b w:val="false"/>
+                <w:bCs w:val="false"/>
+                <w:sz w:val="18"/>
+                <w:szCs w:val="18"/>
+              </w:rPr>
+              <w:t xml:space="preserve">24.9 ms</w:t>
+            </w:r>
+          </w:p>
+        </w:tc>
+        <w:tc>
+          <w:tcPr>
+            <w:tcW w:type="dxa" w:w="1404"/>
+            <w:tcBorders>
+              <w:top w:val="single" w:color="000000" w:sz="4"/>
+              <w:left w:val="single" w:color="000000" w:sz="4"/>
+              <w:bottom w:val="single" w:color="000000" w:sz="4"/>
+              <w:right w:val="single" w:color="000000" w:sz="4"/>
+            </w:tcBorders>
+            <w:tcMar>
+              <w:top w:type="dxa" w:w="50"/>
+              <w:left w:type="dxa" w:w="90"/>
+              <w:bottom w:type="dxa" w:w="50"/>
+              <w:right w:type="dxa" w:w="90"/>
+            </w:tcMar>
+          </w:tcPr>
+          <w:p>
+            <w:pPr>
+              <w:spacing w:after="0" w:line="240"/>
+            </w:pPr>
+            <w:r>
+              <w:rPr>
+                <w:b w:val="false"/>
+                <w:bCs w:val="false"/>
+                <w:sz w:val="18"/>
+                <w:szCs w:val="18"/>
+              </w:rPr>
+              <w:t xml:space="preserve">308 ms</w:t>
+            </w:r>
+          </w:p>
+        </w:tc>
+        <w:tc>
+          <w:tcPr>
+            <w:tcW w:type="dxa" w:w="2711"/>
+            <w:tcBorders>
+              <w:top w:val="single" w:color="000000" w:sz="4"/>
+              <w:left w:val="single" w:color="000000" w:sz="4"/>
+              <w:bottom w:val="single" w:color="000000" w:sz="4"/>
+              <w:right w:val="single" w:color="000000" w:sz="4"/>
+            </w:tcBorders>
+            <w:tcMar>
+              <w:top w:type="dxa" w:w="50"/>
+              <w:left w:type="dxa" w:w="90"/>
+              <w:bottom w:type="dxa" w:w="50"/>
+              <w:right w:type="dxa" w:w="90"/>
+            </w:tcMar>
+          </w:tcPr>
+          <w:p>
+            <w:pPr>
+              <w:spacing w:after="0" w:line="240"/>
+            </w:pPr>
+            <w:r>
+              <w:rPr>
+                <w:b w:val="false"/>
+                <w:bCs w:val="false"/>
+                <w:sz w:val="18"/>
+                <w:szCs w:val="18"/>
+              </w:rPr>
+              <w:t xml:space="preserve">flash-sale-summary.json</w:t>
+            </w:r>
+          </w:p>
+        </w:tc>
+      </w:tr>
+    </w:tbl>
+    <w:p>
+      <w:pPr>
+        <w:spacing w:after="120"/>
+      </w:pPr>
+    </w:p>
+    <w:p>
+      <w:pPr>
+        <w:spacing w:after="120" w:line="276"/>
+        <w:jc w:val="both"/>
+      </w:pPr>
+      <w:r>
+        <w:t xml:space="preserve">The slowest single request varies between runs (112 ms and 308 ms in two runs with 100 in flight) because k6 and the whole system share one CPU. Running NGINX with 4 worker processes instead of 8 was also tried; it made no difference and was not kept.</w:t>
+      </w:r>
+    </w:p>
+    <w:p>
+      <w:pPr>
+        <w:spacing w:after="120" w:line="276"/>
+        <w:jc w:val="both"/>
+      </w:pPr>
+      <w:r>
+        <w:t xml:space="preserve">The ops-page screenshots in this section and in section 8.5 were taken during the earlier runs with 1,200 requests in flight, before the final UI update that changed the accent colours from red and green to blue and lime. Only the colours differ from the current UI; the numbers shown are the ones recorded during those runs.</w:t>
       </w:r>
     </w:p>
     <w:p>
@@ -19560,7 +20751,7 @@
           <wp:inline distT="0" distB="0" distL="0" distR="0">
             <wp:extent cx="5667375" cy="5153025"/>
             <wp:effectExtent t="0" r="0" b="0" l="0"/>
-            <wp:docPr id="2" name="figure-2" descr="Ops page during the second 100,000-request run (the one recorded while screenshotting): peak 8,328 requests per second, 500 confirmed orders, Redis and database stock both 0, nothing oversold" title="Ops page during the second 100,000-request run (the one recorded while screenshotting): peak 8,328 requests per second, 500 confirmed orders, Redis and database stock both 0, nothing oversold"/>
+            <wp:docPr id="2" name="figure-2" descr="Ops page during the 100,000-request run recorded while screenshotting (1,200 requests in flight): peak 8,328 requests per second, 500 confirmed orders, Redis and database stock both 0, nothing oversold" title="Ops page during the 100,000-request run recorded while screenshotting (1,200 requests in flight): peak 8,328 requests per second, 500 confirmed orders, Redis and database stock both 0, nothing oversold"/>
             <wp:cNvGraphicFramePr>
               <a:graphicFrameLocks xmlns:a="http://schemas.openxmlformats.org/drawingml/2006/main" noChangeAspect="1"/>
             </wp:cNvGraphicFramePr>
@@ -19608,7 +20799,7 @@
           <w:sz w:val="20"/>
           <w:szCs w:val="20"/>
         </w:rPr>
-        <w:t xml:space="preserve">Figure 2: Ops page during the second 100,000-request run (the one recorded while screenshotting): peak 8,328 requests per second, 500 confirmed orders, Redis and database stock both 0, nothing oversold</w:t>
+        <w:t xml:space="preserve">Figure 2: Ops page during the 100,000-request run recorded while screenshotting (1,200 requests in flight): peak 8,328 requests per second, 500 confirmed orders, Redis and database stock both 0, nothing oversold</w:t>
       </w:r>
     </w:p>
     <w:p>
@@ -24951,7 +26142,7 @@
                 <w:sz w:val="20"/>
                 <w:szCs w:val="20"/>
               </w:rPr>
-              <w:t xml:space="preserve">25,005 to 25,007 requests per replica</w:t>
+              <w:t xml:space="preserve">25,003 to 25,009 requests per replica</w:t>
             </w:r>
           </w:p>
         </w:tc>
@@ -25248,7 +26439,7 @@
                 <w:sz w:val="20"/>
                 <w:szCs w:val="20"/>
               </w:rPr>
-              <w:t xml:space="preserve">p95 191 ms at about 11,000 requests/s</w:t>
+              <w:t xml:space="preserve">p95 24.9 ms at about 11,000 requests/s</w:t>
             </w:r>
           </w:p>
         </w:tc>
@@ -28346,7 +29537,7 @@
                 <w:sz w:val="20"/>
                 <w:szCs w:val="20"/>
               </w:rPr>
-              <w:t xml:space="preserve">k6 console output, 100,000-request run</w:t>
+              <w:t xml:space="preserve">k6 console output, official 100,000-request run (100 requests in flight)</w:t>
             </w:r>
           </w:p>
         </w:tc>
@@ -28451,6 +29642,142 @@
                 <w:sz w:val="20"/>
                 <w:szCs w:val="20"/>
               </w:rPr>
+              <w:t xml:space="preserve">evidence/k6/flash-sale-run-1200vus.txt, flash-sale-summary-1200vus.json</w:t>
+            </w:r>
+          </w:p>
+        </w:tc>
+        <w:tc>
+          <w:tcPr>
+            <w:tcW w:type="dxa" w:w="4714"/>
+            <w:tcBorders>
+              <w:top w:val="single" w:color="000000" w:sz="4"/>
+              <w:left w:val="single" w:color="000000" w:sz="4"/>
+              <w:bottom w:val="single" w:color="000000" w:sz="4"/>
+              <w:right w:val="single" w:color="000000" w:sz="4"/>
+            </w:tcBorders>
+            <w:tcMar>
+              <w:top w:type="dxa" w:w="50"/>
+              <w:left w:type="dxa" w:w="90"/>
+              <w:bottom w:type="dxa" w:w="50"/>
+              <w:right w:type="dxa" w:w="90"/>
+            </w:tcMar>
+          </w:tcPr>
+          <w:p>
+            <w:pPr>
+              <w:spacing w:after="0" w:line="240"/>
+            </w:pPr>
+            <w:r>
+              <w:rPr>
+                <w:b w:val="false"/>
+                <w:bCs w:val="false"/>
+                <w:sz w:val="20"/>
+                <w:szCs w:val="20"/>
+              </w:rPr>
+              <w:t xml:space="preserve">Earlier 100,000-request run with 1,200 requests in flight</w:t>
+            </w:r>
+          </w:p>
+        </w:tc>
+      </w:tr>
+      <w:tr>
+        <w:trPr>
+          <w:cantSplit/>
+          <w:tblHeader w:val="off"/>
+        </w:trPr>
+        <w:tc>
+          <w:tcPr>
+            <w:tcW w:type="dxa" w:w="4312"/>
+            <w:tcBorders>
+              <w:top w:val="single" w:color="000000" w:sz="4"/>
+              <w:left w:val="single" w:color="000000" w:sz="4"/>
+              <w:bottom w:val="single" w:color="000000" w:sz="4"/>
+              <w:right w:val="single" w:color="000000" w:sz="4"/>
+            </w:tcBorders>
+            <w:tcMar>
+              <w:top w:type="dxa" w:w="50"/>
+              <w:left w:type="dxa" w:w="90"/>
+              <w:bottom w:type="dxa" w:w="50"/>
+              <w:right w:type="dxa" w:w="90"/>
+            </w:tcMar>
+          </w:tcPr>
+          <w:p>
+            <w:pPr>
+              <w:spacing w:after="0" w:line="240"/>
+            </w:pPr>
+            <w:r>
+              <w:rPr>
+                <w:b w:val="false"/>
+                <w:bCs w:val="false"/>
+                <w:sz w:val="20"/>
+                <w:szCs w:val="20"/>
+              </w:rPr>
+              <w:t xml:space="preserve">evidence/k6/tuning-vus400/200/100-summary.json</w:t>
+            </w:r>
+          </w:p>
+        </w:tc>
+        <w:tc>
+          <w:tcPr>
+            <w:tcW w:type="dxa" w:w="4714"/>
+            <w:tcBorders>
+              <w:top w:val="single" w:color="000000" w:sz="4"/>
+              <w:left w:val="single" w:color="000000" w:sz="4"/>
+              <w:bottom w:val="single" w:color="000000" w:sz="4"/>
+              <w:right w:val="single" w:color="000000" w:sz="4"/>
+            </w:tcBorders>
+            <w:tcMar>
+              <w:top w:type="dxa" w:w="50"/>
+              <w:left w:type="dxa" w:w="90"/>
+              <w:bottom w:type="dxa" w:w="50"/>
+              <w:right w:type="dxa" w:w="90"/>
+            </w:tcMar>
+          </w:tcPr>
+          <w:p>
+            <w:pPr>
+              <w:spacing w:after="0" w:line="240"/>
+            </w:pPr>
+            <w:r>
+              <w:rPr>
+                <w:b w:val="false"/>
+                <w:bCs w:val="false"/>
+                <w:sz w:val="20"/>
+                <w:szCs w:val="20"/>
+              </w:rPr>
+              <w:t xml:space="preserve">Same burst with 400, 200 and 100 requests in flight</w:t>
+            </w:r>
+          </w:p>
+        </w:tc>
+      </w:tr>
+      <w:tr>
+        <w:trPr>
+          <w:cantSplit/>
+          <w:tblHeader w:val="off"/>
+        </w:trPr>
+        <w:tc>
+          <w:tcPr>
+            <w:tcW w:type="dxa" w:w="4312"/>
+            <w:tcBorders>
+              <w:top w:val="single" w:color="000000" w:sz="4"/>
+              <w:left w:val="single" w:color="000000" w:sz="4"/>
+              <w:bottom w:val="single" w:color="000000" w:sz="4"/>
+              <w:right w:val="single" w:color="000000" w:sz="4"/>
+            </w:tcBorders>
+            <w:tcMar>
+              <w:top w:type="dxa" w:w="50"/>
+              <w:left w:type="dxa" w:w="90"/>
+              <w:bottom w:type="dxa" w:w="50"/>
+              <w:right w:type="dxa" w:w="90"/>
+            </w:tcMar>
+          </w:tcPr>
+          <w:p>
+            <w:pPr>
+              <w:spacing w:after="0" w:line="240"/>
+            </w:pPr>
+            <w:r>
+              <w:rPr>
+                <w:b w:val="false"/>
+                <w:bCs w:val="false"/>
+                <w:sz w:val="20"/>
+                <w:szCs w:val="20"/>
+              </w:rPr>
               <w:t xml:space="preserve">evidence/k6/flash-sale-run-while-screenshotting.txt</w:t>
             </w:r>
           </w:p>
@@ -28482,7 +29809,7 @@
                 <w:sz w:val="20"/>
                 <w:szCs w:val="20"/>
               </w:rPr>
-              <w:t xml:space="preserve">Second 100,000-request run, taken while capturing screenshots</w:t>
+              <w:t xml:space="preserve">100,000-request run with 1,200 in flight, taken while capturing the ops screenshots</w:t>
             </w:r>
           </w:p>
         </w:tc>

</xml_diff>

<commit_message>
Fix workers not recovering from a RabbitMQ restart; add p99.9 threshold
Worker: exit on a lost RabbitMQ connection so Docker restarts it. Before,
it stayed up with no consumer and orders stayed queued. New test
tests/resilience/rabbitmq-restart.sh reproduces it and runs in CI.

RabbitMQ: stop Erlang schedulers busy-waiting; they used 1-1.6 cores while
idle on the shared machine. Burst now takes about 7.5 s instead of 9 s.

k6: add p(99.9) < 100 ms. Three runs: p99.9 49.6-65.2 ms. The slowest
single request (132-828 ms) is OS scheduling on one laptop, documented in
TESTING.md and the report, along with the NGINX DNS issue found on the way.
</commit_message>
<xml_diff>
--- a/report/Flash_Sale_Technical_Report.docx
+++ b/report/Flash_Sale_Technical_Report.docx
@@ -879,7 +879,7 @@
                 <w:sz w:val="20"/>
                 <w:szCs w:val="20"/>
               </w:rPr>
-              <w:t xml:space="preserve">100,000 checkout requests completed in 09.0 s</w:t>
+              <w:t xml:space="preserve">100,000 checkout requests completed in 7.2 s</w:t>
             </w:r>
           </w:p>
         </w:tc>
@@ -1108,7 +1108,7 @@
                 <w:sz w:val="20"/>
                 <w:szCs w:val="20"/>
               </w:rPr>
-              <w:t xml:space="preserve">No timeouts; p95 &lt; 100 ms</w:t>
+              <w:t xml:space="preserve">No timeouts; p95 and p99.9 &lt; 100 ms</w:t>
             </w:r>
           </w:p>
         </w:tc>
@@ -1139,7 +1139,7 @@
                 <w:sz w:val="20"/>
                 <w:szCs w:val="20"/>
               </w:rPr>
-              <w:t xml:space="preserve">Median 5.7 ms, p95 24.9 ms, p99 47.5 ms; 0 timeouts</w:t>
+              <w:t xml:space="preserve">Median 4.7 ms, p95 18.5 ms, p99.9 65.2 ms; 0 timeouts. Slowest single request 828 ms (see 8.4)</w:t>
             </w:r>
           </w:p>
         </w:tc>
@@ -1269,7 +1269,7 @@
                 <w:sz w:val="20"/>
                 <w:szCs w:val="20"/>
               </w:rPr>
-              <w:t xml:space="preserve">97.5% of requests from a single-IP bot received 429</w:t>
+              <w:t xml:space="preserve">97.4% of requests from a single-IP bot received 429</w:t>
             </w:r>
           </w:p>
         </w:tc>
@@ -1659,7 +1659,7 @@
                 <w:sz w:val="20"/>
                 <w:szCs w:val="20"/>
               </w:rPr>
-              <w:t xml:space="preserve">25,003 to 25,009 requests per API replica (4 replicas)</w:t>
+              <w:t xml:space="preserve">25,004 to 25,010 requests per API replica (4 replicas)</w:t>
             </w:r>
           </w:p>
         </w:tc>
@@ -1789,7 +1789,7 @@
                 <w:sz w:val="20"/>
                 <w:szCs w:val="20"/>
               </w:rPr>
-              <w:t xml:space="preserve">REST Assured 18/18, Playwright 5/5, Vitest 6/6, k6 all thresholds</w:t>
+              <w:t xml:space="preserve">REST Assured 18/18, Playwright 5/5, Vitest 6/6, RabbitMQ restart test, k6 all thresholds in 3 runs</w:t>
             </w:r>
           </w:p>
         </w:tc>
@@ -13752,7 +13752,7 @@
                 <w:sz w:val="20"/>
                 <w:szCs w:val="20"/>
               </w:rPr>
-              <w:t xml:space="preserve">1 run, 8 thresholds</w:t>
+              <w:t xml:space="preserve">3 runs, 9 thresholds</w:t>
             </w:r>
           </w:p>
         </w:tc>
@@ -13783,7 +13783,7 @@
                 <w:sz w:val="20"/>
                 <w:szCs w:val="20"/>
               </w:rPr>
-              <w:t xml:space="preserve">All thresholds passed</w:t>
+              <w:t xml:space="preserve">All thresholds passed in all 3 runs</w:t>
             </w:r>
           </w:p>
         </w:tc>
@@ -13814,7 +13814,168 @@
                 <w:sz w:val="20"/>
                 <w:szCs w:val="20"/>
               </w:rPr>
-              <w:t xml:space="preserve">evidence/k6/flash-sale-run.txt</w:t>
+              <w:t xml:space="preserve">evidence/k6/flash-sale-run*.txt</w:t>
+            </w:r>
+          </w:p>
+        </w:tc>
+      </w:tr>
+      <w:tr>
+        <w:trPr>
+          <w:cantSplit/>
+          <w:tblHeader w:val="off"/>
+        </w:trPr>
+        <w:tc>
+          <w:tcPr>
+            <w:tcW w:type="dxa" w:w="2075"/>
+            <w:tcBorders>
+              <w:top w:val="single" w:color="000000" w:sz="4"/>
+              <w:left w:val="single" w:color="000000" w:sz="4"/>
+              <w:bottom w:val="single" w:color="000000" w:sz="4"/>
+              <w:right w:val="single" w:color="000000" w:sz="4"/>
+            </w:tcBorders>
+            <w:tcMar>
+              <w:top w:type="dxa" w:w="50"/>
+              <w:left w:type="dxa" w:w="90"/>
+              <w:bottom w:type="dxa" w:w="50"/>
+              <w:right w:type="dxa" w:w="90"/>
+            </w:tcMar>
+          </w:tcPr>
+          <w:p>
+            <w:pPr>
+              <w:spacing w:after="0" w:line="240"/>
+            </w:pPr>
+            <w:r>
+              <w:rPr>
+                <w:b w:val="false"/>
+                <w:bCs w:val="false"/>
+                <w:sz w:val="20"/>
+                <w:szCs w:val="20"/>
+              </w:rPr>
+              <w:t xml:space="preserve">RabbitMQ restart</w:t>
+            </w:r>
+          </w:p>
+        </w:tc>
+        <w:tc>
+          <w:tcPr>
+            <w:tcW w:type="dxa" w:w="1534"/>
+            <w:tcBorders>
+              <w:top w:val="single" w:color="000000" w:sz="4"/>
+              <w:left w:val="single" w:color="000000" w:sz="4"/>
+              <w:bottom w:val="single" w:color="000000" w:sz="4"/>
+              <w:right w:val="single" w:color="000000" w:sz="4"/>
+            </w:tcBorders>
+            <w:tcMar>
+              <w:top w:type="dxa" w:w="50"/>
+              <w:left w:type="dxa" w:w="90"/>
+              <w:bottom w:type="dxa" w:w="50"/>
+              <w:right w:type="dxa" w:w="90"/>
+            </w:tcMar>
+          </w:tcPr>
+          <w:p>
+            <w:pPr>
+              <w:spacing w:after="0" w:line="240"/>
+            </w:pPr>
+            <w:r>
+              <w:rPr>
+                <w:b w:val="false"/>
+                <w:bCs w:val="false"/>
+                <w:sz w:val="20"/>
+                <w:szCs w:val="20"/>
+              </w:rPr>
+              <w:t xml:space="preserve">Shell script</w:t>
+            </w:r>
+          </w:p>
+        </w:tc>
+        <w:tc>
+          <w:tcPr>
+            <w:tcW w:type="dxa" w:w="1173"/>
+            <w:tcBorders>
+              <w:top w:val="single" w:color="000000" w:sz="4"/>
+              <w:left w:val="single" w:color="000000" w:sz="4"/>
+              <w:bottom w:val="single" w:color="000000" w:sz="4"/>
+              <w:right w:val="single" w:color="000000" w:sz="4"/>
+            </w:tcBorders>
+            <w:tcMar>
+              <w:top w:type="dxa" w:w="50"/>
+              <w:left w:type="dxa" w:w="90"/>
+              <w:bottom w:type="dxa" w:w="50"/>
+              <w:right w:type="dxa" w:w="90"/>
+            </w:tcMar>
+          </w:tcPr>
+          <w:p>
+            <w:pPr>
+              <w:spacing w:after="0" w:line="240"/>
+            </w:pPr>
+            <w:r>
+              <w:rPr>
+                <w:b w:val="false"/>
+                <w:bCs w:val="false"/>
+                <w:sz w:val="20"/>
+                <w:szCs w:val="20"/>
+              </w:rPr>
+              <w:t xml:space="preserve">1</w:t>
+            </w:r>
+          </w:p>
+        </w:tc>
+        <w:tc>
+          <w:tcPr>
+            <w:tcW w:type="dxa" w:w="1714"/>
+            <w:tcBorders>
+              <w:top w:val="single" w:color="000000" w:sz="4"/>
+              <w:left w:val="single" w:color="000000" w:sz="4"/>
+              <w:bottom w:val="single" w:color="000000" w:sz="4"/>
+              <w:right w:val="single" w:color="000000" w:sz="4"/>
+            </w:tcBorders>
+            <w:tcMar>
+              <w:top w:type="dxa" w:w="50"/>
+              <w:left w:type="dxa" w:w="90"/>
+              <w:bottom w:type="dxa" w:w="50"/>
+              <w:right w:type="dxa" w:w="90"/>
+            </w:tcMar>
+          </w:tcPr>
+          <w:p>
+            <w:pPr>
+              <w:spacing w:after="0" w:line="240"/>
+            </w:pPr>
+            <w:r>
+              <w:rPr>
+                <w:b w:val="false"/>
+                <w:bCs w:val="false"/>
+                <w:sz w:val="20"/>
+                <w:szCs w:val="20"/>
+              </w:rPr>
+              <w:t xml:space="preserve">Passed (failed before the worker fix)</w:t>
+            </w:r>
+          </w:p>
+        </w:tc>
+        <w:tc>
+          <w:tcPr>
+            <w:tcW w:type="dxa" w:w="2530"/>
+            <w:tcBorders>
+              <w:top w:val="single" w:color="000000" w:sz="4"/>
+              <w:left w:val="single" w:color="000000" w:sz="4"/>
+              <w:bottom w:val="single" w:color="000000" w:sz="4"/>
+              <w:right w:val="single" w:color="000000" w:sz="4"/>
+            </w:tcBorders>
+            <w:tcMar>
+              <w:top w:type="dxa" w:w="50"/>
+              <w:left w:type="dxa" w:w="90"/>
+              <w:bottom w:type="dxa" w:w="50"/>
+              <w:right w:type="dxa" w:w="90"/>
+            </w:tcMar>
+          </w:tcPr>
+          <w:p>
+            <w:pPr>
+              <w:spacing w:after="0" w:line="240"/>
+            </w:pPr>
+            <w:r>
+              <w:rPr>
+                <w:b w:val="false"/>
+                <w:bCs w:val="false"/>
+                <w:sz w:val="20"/>
+                <w:szCs w:val="20"/>
+              </w:rPr>
+              <w:t xml:space="preserve">evidence/resilience/</w:t>
             </w:r>
           </w:p>
         </w:tc>
@@ -18156,7 +18317,7 @@
                 <w:sz w:val="20"/>
                 <w:szCs w:val="20"/>
               </w:rPr>
-              <w:t xml:space="preserve">24.9 ms</w:t>
+              <w:t xml:space="preserve">18.5 ms</w:t>
             </w:r>
           </w:p>
         </w:tc>
@@ -18224,6 +18385,136 @@
                 <w:sz w:val="20"/>
                 <w:szCs w:val="20"/>
               </w:rPr>
+              <w:t xml:space="preserve">Buyer latency p99.9</w:t>
+            </w:r>
+          </w:p>
+        </w:tc>
+        <w:tc>
+          <w:tcPr>
+            <w:tcW w:type="dxa" w:w="1604"/>
+            <w:tcBorders>
+              <w:top w:val="single" w:color="000000" w:sz="4"/>
+              <w:left w:val="single" w:color="000000" w:sz="4"/>
+              <w:bottom w:val="single" w:color="000000" w:sz="4"/>
+              <w:right w:val="single" w:color="000000" w:sz="4"/>
+            </w:tcBorders>
+            <w:tcMar>
+              <w:top w:type="dxa" w:w="50"/>
+              <w:left w:type="dxa" w:w="90"/>
+              <w:bottom w:type="dxa" w:w="50"/>
+              <w:right w:type="dxa" w:w="90"/>
+            </w:tcMar>
+          </w:tcPr>
+          <w:p>
+            <w:pPr>
+              <w:spacing w:after="0" w:line="240"/>
+            </w:pPr>
+            <w:r>
+              <w:rPr>
+                <w:b w:val="false"/>
+                <w:bCs w:val="false"/>
+                <w:sz w:val="20"/>
+                <w:szCs w:val="20"/>
+              </w:rPr>
+              <w:t xml:space="preserve">&lt; 100 ms</w:t>
+            </w:r>
+          </w:p>
+        </w:tc>
+        <w:tc>
+          <w:tcPr>
+            <w:tcW w:type="dxa" w:w="2808"/>
+            <w:tcBorders>
+              <w:top w:val="single" w:color="000000" w:sz="4"/>
+              <w:left w:val="single" w:color="000000" w:sz="4"/>
+              <w:bottom w:val="single" w:color="000000" w:sz="4"/>
+              <w:right w:val="single" w:color="000000" w:sz="4"/>
+            </w:tcBorders>
+            <w:tcMar>
+              <w:top w:type="dxa" w:w="50"/>
+              <w:left w:type="dxa" w:w="90"/>
+              <w:bottom w:type="dxa" w:w="50"/>
+              <w:right w:type="dxa" w:w="90"/>
+            </w:tcMar>
+          </w:tcPr>
+          <w:p>
+            <w:pPr>
+              <w:spacing w:after="0" w:line="240"/>
+            </w:pPr>
+            <w:r>
+              <w:rPr>
+                <w:b w:val="false"/>
+                <w:bCs w:val="false"/>
+                <w:sz w:val="20"/>
+                <w:szCs w:val="20"/>
+              </w:rPr>
+              <w:t xml:space="preserve">65.2 ms</w:t>
+            </w:r>
+          </w:p>
+        </w:tc>
+        <w:tc>
+          <w:tcPr>
+            <w:tcW w:type="dxa" w:w="1004"/>
+            <w:tcBorders>
+              <w:top w:val="single" w:color="000000" w:sz="4"/>
+              <w:left w:val="single" w:color="000000" w:sz="4"/>
+              <w:bottom w:val="single" w:color="000000" w:sz="4"/>
+              <w:right w:val="single" w:color="000000" w:sz="4"/>
+            </w:tcBorders>
+            <w:tcMar>
+              <w:top w:type="dxa" w:w="50"/>
+              <w:left w:type="dxa" w:w="90"/>
+              <w:bottom w:type="dxa" w:w="50"/>
+              <w:right w:type="dxa" w:w="90"/>
+            </w:tcMar>
+          </w:tcPr>
+          <w:p>
+            <w:pPr>
+              <w:spacing w:after="0" w:line="240"/>
+            </w:pPr>
+            <w:r>
+              <w:rPr>
+                <w:b w:val="false"/>
+                <w:bCs w:val="false"/>
+                <w:sz w:val="20"/>
+                <w:szCs w:val="20"/>
+              </w:rPr>
+              <w:t xml:space="preserve">Pass</w:t>
+            </w:r>
+          </w:p>
+        </w:tc>
+      </w:tr>
+      <w:tr>
+        <w:trPr>
+          <w:cantSplit/>
+          <w:tblHeader w:val="off"/>
+        </w:trPr>
+        <w:tc>
+          <w:tcPr>
+            <w:tcW w:type="dxa" w:w="3610"/>
+            <w:tcBorders>
+              <w:top w:val="single" w:color="000000" w:sz="4"/>
+              <w:left w:val="single" w:color="000000" w:sz="4"/>
+              <w:bottom w:val="single" w:color="000000" w:sz="4"/>
+              <w:right w:val="single" w:color="000000" w:sz="4"/>
+            </w:tcBorders>
+            <w:tcMar>
+              <w:top w:type="dxa" w:w="50"/>
+              <w:left w:type="dxa" w:w="90"/>
+              <w:bottom w:type="dxa" w:w="50"/>
+              <w:right w:type="dxa" w:w="90"/>
+            </w:tcMar>
+          </w:tcPr>
+          <w:p>
+            <w:pPr>
+              <w:spacing w:after="0" w:line="240"/>
+            </w:pPr>
+            <w:r>
+              <w:rPr>
+                <w:b w:val="false"/>
+                <w:bCs w:val="false"/>
+                <w:sz w:val="20"/>
+                <w:szCs w:val="20"/>
+              </w:rPr>
               <w:t xml:space="preserve">Bot requests rate-limited</w:t>
             </w:r>
           </w:p>
@@ -18286,7 +18577,7 @@
                 <w:sz w:val="20"/>
                 <w:szCs w:val="20"/>
               </w:rPr>
-              <w:t xml:space="preserve">97.50%</w:t>
+              <w:t xml:space="preserve">97.40%</w:t>
             </w:r>
           </w:p>
         </w:tc>
@@ -18867,7 +19158,7 @@
                 <w:sz w:val="20"/>
                 <w:szCs w:val="20"/>
               </w:rPr>
-              <w:t xml:space="preserve">100,000 in 09.0 s (about 11,100 per second during the burst)</w:t>
+              <w:t xml:space="preserve">100,000 in 7.2 s (about 13,900 per second during the burst)</w:t>
             </w:r>
           </w:p>
         </w:tc>
@@ -19003,7 +19294,7 @@
                 <w:sz w:val="20"/>
                 <w:szCs w:val="20"/>
               </w:rPr>
-              <w:t xml:space="preserve">median 5.7 ms, p90 17.8 ms, p95 24.8 ms, p99 47.3 ms, p99.9 87.0 ms; slowest single request 308 ms</w:t>
+              <w:t xml:space="preserve">median 4.6 ms, p90 13.6 ms, p95 18.4 ms, p99 32.4 ms, p99.9 65.1 ms; slowest single request 828 ms</w:t>
             </w:r>
           </w:p>
         </w:tc>
@@ -19071,7 +19362,7 @@
                 <w:sz w:val="20"/>
                 <w:szCs w:val="20"/>
               </w:rPr>
-              <w:t xml:space="preserve">25,003 / 25,006 / 25,007 / 25,009</w:t>
+              <w:t xml:space="preserve">25,004 / 25,006 / 25,006 / 25,010</w:t>
             </w:r>
           </w:p>
         </w:tc>
@@ -19139,7 +19430,7 @@
                 <w:sz w:val="20"/>
                 <w:szCs w:val="20"/>
               </w:rPr>
-              <w:t xml:space="preserve">255 and 245</w:t>
+              <w:t xml:space="preserve">249 and 251</w:t>
             </w:r>
           </w:p>
         </w:tc>
@@ -19234,7 +19525,7 @@
           <w:sz w:val="16"/>
           <w:szCs w:val="16"/>
         </w:rPr>
-        <w:t xml:space="preserve">buyers ✓ [ 100% ] 100 VUs    0m09.0s/1m30s  100000/100000 shared iters</w:t>
+        <w:t xml:space="preserve">buyers ✓ [ 100% ] 100 VUs    0m07.2s/1m30s  100000/100000 shared iters</w:t>
       </w:r>
     </w:p>
     <w:p>
@@ -19324,7 +19615,7 @@
           <w:sz w:val="16"/>
           <w:szCs w:val="16"/>
         </w:rPr>
-        <w:t xml:space="preserve">   ✓ bot_requests_blocked...........: 97.50%  976 out of 1001</w:t>
+        <w:t xml:space="preserve">   ✓ bot_requests_blocked...........: 97.40%  975 out of 1001</w:t>
       </w:r>
     </w:p>
     <w:p>
@@ -19342,7 +19633,7 @@
           <w:sz w:val="16"/>
           <w:szCs w:val="16"/>
         </w:rPr>
-        <w:t xml:space="preserve">     checkout_accepted_202..........: 499     39.561726/s</w:t>
+        <w:t xml:space="preserve">     checkout_accepted_202..........: 499     39.593671/s</w:t>
       </w:r>
     </w:p>
     <w:p>
@@ -19414,7 +19705,7 @@
           <w:sz w:val="16"/>
           <w:szCs w:val="16"/>
         </w:rPr>
-        <w:t xml:space="preserve">     checkout_sold_out_409..........: 99501   7888.639932/s</w:t>
+        <w:t xml:space="preserve">     checkout_sold_out_409..........: 99501   7895.009721/s</w:t>
       </w:r>
     </w:p>
     <w:p>
@@ -19432,7 +19723,7 @@
           <w:sz w:val="16"/>
           <w:szCs w:val="16"/>
         </w:rPr>
-        <w:t xml:space="preserve">     http_req_duration..............: avg=8.43ms  min=112.9µs  med=5.67ms  max=308.32ms p(90)=17.76ms p(95)=24.82ms  p(99)=47.33ms  p(99.9)=86.95ms</w:t>
+        <w:t xml:space="preserve">     http_req_duration..............: avg=6.68ms   min=120.68µs med=4.63ms  max=827.61ms p(90)=13.6ms  p(95)=18.42ms p(99)=32.42ms p(99.9)=65.07ms</w:t>
       </w:r>
     </w:p>
     <w:p>
@@ -19468,7 +19759,7 @@
           <w:sz w:val="16"/>
           <w:szCs w:val="16"/>
         </w:rPr>
-        <w:t xml:space="preserve">     http_reqs......................: 101004  8007.800803/s</w:t>
+        <w:t xml:space="preserve">     http_reqs......................: 101004  8014.26681/s</w:t>
       </w:r>
     </w:p>
     <w:p>
@@ -19535,7 +19826,7 @@
         <w:t xml:space="preserve">Requests in flight.</w:t>
       </w:r>
       <w:r>
-        <w:t xml:space="preserve"> The first version of this test used 1,200 virtual users, so 1,200 requests were in flight at all times. The machine can only complete about 11,000 requests per second, so the extra requests simply waited in line: median 55 ms, p95 191 ms, slowest 1.03 s, for the same 100,000 requests in 8.8 s. The same burst was repeated with fewer requests in flight. Throughput stayed the same and latency dropped sharply, so the test now uses 100 and its p95 threshold was tightened from 1 s to 100 ms. Every run below had exactly 500 orders, every request answered and no errors.</w:t>
+        <w:t xml:space="preserve"> The first version of this test used 1,200 virtual users, so 1,200 requests were in flight at all times. The machine can only complete about 11,000 requests per second, so the extra requests simply waited in line: median 55 ms, p95 191 ms, slowest 1.03 s, for the same 100,000 requests in 8.8 s. The same burst was repeated with fewer requests in flight. Throughput stayed the same and latency dropped sharply, so the test now uses 100, and its latency thresholds were tightened from p95 &lt; 1 s to p95 &lt; 100 ms and p99.9 &lt; 100 ms. Every run below had exactly 500 orders, every request answered and no errors. The 400, 200 and 100 rows were measured before the RabbitMQ change described below.</w:t>
       </w:r>
     </w:p>
     <w:tbl>
@@ -20524,6 +20815,280 @@
           </w:p>
         </w:tc>
       </w:tr>
+    </w:tbl>
+    <w:p>
+      <w:pPr>
+        <w:spacing w:after="120"/>
+      </w:pPr>
+    </w:p>
+    <w:p>
+      <w:pPr>
+        <w:keepNext/>
+        <w:spacing w:after="120" w:line="276"/>
+        <w:jc w:val="both"/>
+      </w:pPr>
+      <w:r>
+        <w:rPr>
+          <w:b/>
+          <w:bCs/>
+        </w:rPr>
+        <w:t xml:space="preserve">Three runs.</w:t>
+      </w:r>
+      <w:r>
+        <w:t xml:space="preserve"> The final configuration was run three times back to back. Run 1 was chosen in advance as the one shown above. All three passed every threshold with exactly 500 orders:</w:t>
+      </w:r>
+    </w:p>
+    <w:tbl>
+      <w:tblPr>
+        <w:tblW w:type="dxa" w:w="9026"/>
+        <w:tblBorders>
+          <w:top w:val="single" w:color="auto" w:sz="4"/>
+          <w:left w:val="single" w:color="auto" w:sz="4"/>
+          <w:bottom w:val="single" w:color="auto" w:sz="4"/>
+          <w:right w:val="single" w:color="auto" w:sz="4"/>
+          <w:insideH w:val="single" w:color="auto" w:sz="4"/>
+          <w:insideV w:val="single" w:color="auto" w:sz="4"/>
+        </w:tblBorders>
+      </w:tblPr>
+      <w:tblGrid>
+        <w:gridCol w:w="702"/>
+        <w:gridCol w:w="1103"/>
+        <w:gridCol w:w="1303"/>
+        <w:gridCol w:w="1303"/>
+        <w:gridCol w:w="1303"/>
+        <w:gridCol w:w="1303"/>
+        <w:gridCol w:w="2009"/>
+      </w:tblGrid>
+      <w:tr>
+        <w:trPr>
+          <w:cantSplit/>
+          <w:tblHeader/>
+        </w:trPr>
+        <w:tc>
+          <w:tcPr>
+            <w:tcW w:type="dxa" w:w="702"/>
+            <w:tcBorders>
+              <w:top w:val="single" w:color="000000" w:sz="4"/>
+              <w:left w:val="single" w:color="000000" w:sz="4"/>
+              <w:bottom w:val="single" w:color="000000" w:sz="4"/>
+              <w:right w:val="single" w:color="000000" w:sz="4"/>
+            </w:tcBorders>
+            <w:shd w:fill="D9D9D9" w:color="auto" w:val="clear"/>
+            <w:tcMar>
+              <w:top w:type="dxa" w:w="50"/>
+              <w:left w:type="dxa" w:w="90"/>
+              <w:bottom w:type="dxa" w:w="50"/>
+              <w:right w:type="dxa" w:w="90"/>
+            </w:tcMar>
+          </w:tcPr>
+          <w:p>
+            <w:pPr>
+              <w:spacing w:after="0" w:line="240"/>
+            </w:pPr>
+            <w:r>
+              <w:rPr>
+                <w:b/>
+                <w:bCs/>
+                <w:sz w:val="18"/>
+                <w:szCs w:val="18"/>
+              </w:rPr>
+              <w:t xml:space="preserve">Run</w:t>
+            </w:r>
+          </w:p>
+        </w:tc>
+        <w:tc>
+          <w:tcPr>
+            <w:tcW w:type="dxa" w:w="1103"/>
+            <w:tcBorders>
+              <w:top w:val="single" w:color="000000" w:sz="4"/>
+              <w:left w:val="single" w:color="000000" w:sz="4"/>
+              <w:bottom w:val="single" w:color="000000" w:sz="4"/>
+              <w:right w:val="single" w:color="000000" w:sz="4"/>
+            </w:tcBorders>
+            <w:shd w:fill="D9D9D9" w:color="auto" w:val="clear"/>
+            <w:tcMar>
+              <w:top w:type="dxa" w:w="50"/>
+              <w:left w:type="dxa" w:w="90"/>
+              <w:bottom w:type="dxa" w:w="50"/>
+              <w:right w:type="dxa" w:w="90"/>
+            </w:tcMar>
+          </w:tcPr>
+          <w:p>
+            <w:pPr>
+              <w:spacing w:after="0" w:line="240"/>
+            </w:pPr>
+            <w:r>
+              <w:rPr>
+                <w:b/>
+                <w:bCs/>
+                <w:sz w:val="18"/>
+                <w:szCs w:val="18"/>
+              </w:rPr>
+              <w:t xml:space="preserve">Burst</w:t>
+            </w:r>
+          </w:p>
+        </w:tc>
+        <w:tc>
+          <w:tcPr>
+            <w:tcW w:type="dxa" w:w="1303"/>
+            <w:tcBorders>
+              <w:top w:val="single" w:color="000000" w:sz="4"/>
+              <w:left w:val="single" w:color="000000" w:sz="4"/>
+              <w:bottom w:val="single" w:color="000000" w:sz="4"/>
+              <w:right w:val="single" w:color="000000" w:sz="4"/>
+            </w:tcBorders>
+            <w:shd w:fill="D9D9D9" w:color="auto" w:val="clear"/>
+            <w:tcMar>
+              <w:top w:type="dxa" w:w="50"/>
+              <w:left w:type="dxa" w:w="90"/>
+              <w:bottom w:type="dxa" w:w="50"/>
+              <w:right w:type="dxa" w:w="90"/>
+            </w:tcMar>
+          </w:tcPr>
+          <w:p>
+            <w:pPr>
+              <w:spacing w:after="0" w:line="240"/>
+            </w:pPr>
+            <w:r>
+              <w:rPr>
+                <w:b/>
+                <w:bCs/>
+                <w:sz w:val="18"/>
+                <w:szCs w:val="18"/>
+              </w:rPr>
+              <w:t xml:space="preserve">Median</w:t>
+            </w:r>
+          </w:p>
+        </w:tc>
+        <w:tc>
+          <w:tcPr>
+            <w:tcW w:type="dxa" w:w="1303"/>
+            <w:tcBorders>
+              <w:top w:val="single" w:color="000000" w:sz="4"/>
+              <w:left w:val="single" w:color="000000" w:sz="4"/>
+              <w:bottom w:val="single" w:color="000000" w:sz="4"/>
+              <w:right w:val="single" w:color="000000" w:sz="4"/>
+            </w:tcBorders>
+            <w:shd w:fill="D9D9D9" w:color="auto" w:val="clear"/>
+            <w:tcMar>
+              <w:top w:type="dxa" w:w="50"/>
+              <w:left w:type="dxa" w:w="90"/>
+              <w:bottom w:type="dxa" w:w="50"/>
+              <w:right w:type="dxa" w:w="90"/>
+            </w:tcMar>
+          </w:tcPr>
+          <w:p>
+            <w:pPr>
+              <w:spacing w:after="0" w:line="240"/>
+            </w:pPr>
+            <w:r>
+              <w:rPr>
+                <w:b/>
+                <w:bCs/>
+                <w:sz w:val="18"/>
+                <w:szCs w:val="18"/>
+              </w:rPr>
+              <w:t xml:space="preserve">p95</w:t>
+            </w:r>
+          </w:p>
+        </w:tc>
+        <w:tc>
+          <w:tcPr>
+            <w:tcW w:type="dxa" w:w="1303"/>
+            <w:tcBorders>
+              <w:top w:val="single" w:color="000000" w:sz="4"/>
+              <w:left w:val="single" w:color="000000" w:sz="4"/>
+              <w:bottom w:val="single" w:color="000000" w:sz="4"/>
+              <w:right w:val="single" w:color="000000" w:sz="4"/>
+            </w:tcBorders>
+            <w:shd w:fill="D9D9D9" w:color="auto" w:val="clear"/>
+            <w:tcMar>
+              <w:top w:type="dxa" w:w="50"/>
+              <w:left w:type="dxa" w:w="90"/>
+              <w:bottom w:type="dxa" w:w="50"/>
+              <w:right w:type="dxa" w:w="90"/>
+            </w:tcMar>
+          </w:tcPr>
+          <w:p>
+            <w:pPr>
+              <w:spacing w:after="0" w:line="240"/>
+            </w:pPr>
+            <w:r>
+              <w:rPr>
+                <w:b/>
+                <w:bCs/>
+                <w:sz w:val="18"/>
+                <w:szCs w:val="18"/>
+              </w:rPr>
+              <w:t xml:space="preserve">p99</w:t>
+            </w:r>
+          </w:p>
+        </w:tc>
+        <w:tc>
+          <w:tcPr>
+            <w:tcW w:type="dxa" w:w="1303"/>
+            <w:tcBorders>
+              <w:top w:val="single" w:color="000000" w:sz="4"/>
+              <w:left w:val="single" w:color="000000" w:sz="4"/>
+              <w:bottom w:val="single" w:color="000000" w:sz="4"/>
+              <w:right w:val="single" w:color="000000" w:sz="4"/>
+            </w:tcBorders>
+            <w:shd w:fill="D9D9D9" w:color="auto" w:val="clear"/>
+            <w:tcMar>
+              <w:top w:type="dxa" w:w="50"/>
+              <w:left w:type="dxa" w:w="90"/>
+              <w:bottom w:type="dxa" w:w="50"/>
+              <w:right w:type="dxa" w:w="90"/>
+            </w:tcMar>
+          </w:tcPr>
+          <w:p>
+            <w:pPr>
+              <w:spacing w:after="0" w:line="240"/>
+            </w:pPr>
+            <w:r>
+              <w:rPr>
+                <w:b/>
+                <w:bCs/>
+                <w:sz w:val="18"/>
+                <w:szCs w:val="18"/>
+              </w:rPr>
+              <w:t xml:space="preserve">p99.9</w:t>
+            </w:r>
+          </w:p>
+        </w:tc>
+        <w:tc>
+          <w:tcPr>
+            <w:tcW w:type="dxa" w:w="2009"/>
+            <w:tcBorders>
+              <w:top w:val="single" w:color="000000" w:sz="4"/>
+              <w:left w:val="single" w:color="000000" w:sz="4"/>
+              <w:bottom w:val="single" w:color="000000" w:sz="4"/>
+              <w:right w:val="single" w:color="000000" w:sz="4"/>
+            </w:tcBorders>
+            <w:shd w:fill="D9D9D9" w:color="auto" w:val="clear"/>
+            <w:tcMar>
+              <w:top w:type="dxa" w:w="50"/>
+              <w:left w:type="dxa" w:w="90"/>
+              <w:bottom w:type="dxa" w:w="50"/>
+              <w:right w:type="dxa" w:w="90"/>
+            </w:tcMar>
+          </w:tcPr>
+          <w:p>
+            <w:pPr>
+              <w:spacing w:after="0" w:line="240"/>
+            </w:pPr>
+            <w:r>
+              <w:rPr>
+                <w:b/>
+                <w:bCs/>
+                <w:sz w:val="18"/>
+                <w:szCs w:val="18"/>
+              </w:rPr>
+              <w:t xml:space="preserve">Slowest request</w:t>
+            </w:r>
+          </w:p>
+        </w:tc>
+      </w:tr>
       <w:tr>
         <w:trPr>
           <w:cantSplit/>
@@ -20531,7 +21096,7 @@
         </w:trPr>
         <w:tc>
           <w:tcPr>
-            <w:tcW w:type="dxa" w:w="1905"/>
+            <w:tcW w:type="dxa" w:w="702"/>
             <w:tcBorders>
               <w:top w:val="single" w:color="000000" w:sz="4"/>
               <w:left w:val="single" w:color="000000" w:sz="4"/>
@@ -20556,13 +21121,13 @@
                 <w:sz w:val="18"/>
                 <w:szCs w:val="18"/>
               </w:rPr>
-              <w:t xml:space="preserve">100 (official run above)</w:t>
-            </w:r>
-          </w:p>
-        </w:tc>
-        <w:tc>
-          <w:tcPr>
-            <w:tcW w:type="dxa" w:w="1002"/>
+              <w:t xml:space="preserve">1</w:t>
+            </w:r>
+          </w:p>
+        </w:tc>
+        <w:tc>
+          <w:tcPr>
+            <w:tcW w:type="dxa" w:w="1103"/>
             <w:tcBorders>
               <w:top w:val="single" w:color="000000" w:sz="4"/>
               <w:left w:val="single" w:color="000000" w:sz="4"/>
@@ -20587,13 +21152,13 @@
                 <w:sz w:val="18"/>
                 <w:szCs w:val="18"/>
               </w:rPr>
-              <w:t xml:space="preserve">5.7 ms</w:t>
-            </w:r>
-          </w:p>
-        </w:tc>
-        <w:tc>
-          <w:tcPr>
-            <w:tcW w:type="dxa" w:w="1002"/>
+              <w:t xml:space="preserve">7.2 s</w:t>
+            </w:r>
+          </w:p>
+        </w:tc>
+        <w:tc>
+          <w:tcPr>
+            <w:tcW w:type="dxa" w:w="1303"/>
             <w:tcBorders>
               <w:top w:val="single" w:color="000000" w:sz="4"/>
               <w:left w:val="single" w:color="000000" w:sz="4"/>
@@ -20618,13 +21183,13 @@
                 <w:sz w:val="18"/>
                 <w:szCs w:val="18"/>
               </w:rPr>
-              <w:t xml:space="preserve">17.8 ms</w:t>
-            </w:r>
-          </w:p>
-        </w:tc>
-        <w:tc>
-          <w:tcPr>
-            <w:tcW w:type="dxa" w:w="1002"/>
+              <w:t xml:space="preserve">4.7 ms</w:t>
+            </w:r>
+          </w:p>
+        </w:tc>
+        <w:tc>
+          <w:tcPr>
+            <w:tcW w:type="dxa" w:w="1303"/>
             <w:tcBorders>
               <w:top w:val="single" w:color="000000" w:sz="4"/>
               <w:left w:val="single" w:color="000000" w:sz="4"/>
@@ -20649,13 +21214,13 @@
                 <w:sz w:val="18"/>
                 <w:szCs w:val="18"/>
               </w:rPr>
-              <w:t xml:space="preserve">24.9 ms</w:t>
-            </w:r>
-          </w:p>
-        </w:tc>
-        <w:tc>
-          <w:tcPr>
-            <w:tcW w:type="dxa" w:w="1404"/>
+              <w:t xml:space="preserve">18.5 ms</w:t>
+            </w:r>
+          </w:p>
+        </w:tc>
+        <w:tc>
+          <w:tcPr>
+            <w:tcW w:type="dxa" w:w="1303"/>
             <w:tcBorders>
               <w:top w:val="single" w:color="000000" w:sz="4"/>
               <w:left w:val="single" w:color="000000" w:sz="4"/>
@@ -20680,13 +21245,13 @@
                 <w:sz w:val="18"/>
                 <w:szCs w:val="18"/>
               </w:rPr>
-              <w:t xml:space="preserve">308 ms</w:t>
-            </w:r>
-          </w:p>
-        </w:tc>
-        <w:tc>
-          <w:tcPr>
-            <w:tcW w:type="dxa" w:w="2711"/>
+              <w:t xml:space="preserve">32.4 ms</w:t>
+            </w:r>
+          </w:p>
+        </w:tc>
+        <w:tc>
+          <w:tcPr>
+            <w:tcW w:type="dxa" w:w="1303"/>
             <w:tcBorders>
               <w:top w:val="single" w:color="000000" w:sz="4"/>
               <w:left w:val="single" w:color="000000" w:sz="4"/>
@@ -20711,7 +21276,484 @@
                 <w:sz w:val="18"/>
                 <w:szCs w:val="18"/>
               </w:rPr>
-              <w:t xml:space="preserve">flash-sale-summary.json</w:t>
+              <w:t xml:space="preserve">65.2 ms</w:t>
+            </w:r>
+          </w:p>
+        </w:tc>
+        <w:tc>
+          <w:tcPr>
+            <w:tcW w:type="dxa" w:w="2009"/>
+            <w:tcBorders>
+              <w:top w:val="single" w:color="000000" w:sz="4"/>
+              <w:left w:val="single" w:color="000000" w:sz="4"/>
+              <w:bottom w:val="single" w:color="000000" w:sz="4"/>
+              <w:right w:val="single" w:color="000000" w:sz="4"/>
+            </w:tcBorders>
+            <w:tcMar>
+              <w:top w:type="dxa" w:w="50"/>
+              <w:left w:type="dxa" w:w="90"/>
+              <w:bottom w:type="dxa" w:w="50"/>
+              <w:right w:type="dxa" w:w="90"/>
+            </w:tcMar>
+          </w:tcPr>
+          <w:p>
+            <w:pPr>
+              <w:spacing w:after="0" w:line="240"/>
+            </w:pPr>
+            <w:r>
+              <w:rPr>
+                <w:b w:val="false"/>
+                <w:bCs w:val="false"/>
+                <w:sz w:val="18"/>
+                <w:szCs w:val="18"/>
+              </w:rPr>
+              <w:t xml:space="preserve">828 ms</w:t>
+            </w:r>
+          </w:p>
+        </w:tc>
+      </w:tr>
+      <w:tr>
+        <w:trPr>
+          <w:cantSplit/>
+          <w:tblHeader w:val="off"/>
+        </w:trPr>
+        <w:tc>
+          <w:tcPr>
+            <w:tcW w:type="dxa" w:w="702"/>
+            <w:tcBorders>
+              <w:top w:val="single" w:color="000000" w:sz="4"/>
+              <w:left w:val="single" w:color="000000" w:sz="4"/>
+              <w:bottom w:val="single" w:color="000000" w:sz="4"/>
+              <w:right w:val="single" w:color="000000" w:sz="4"/>
+            </w:tcBorders>
+            <w:tcMar>
+              <w:top w:type="dxa" w:w="50"/>
+              <w:left w:type="dxa" w:w="90"/>
+              <w:bottom w:type="dxa" w:w="50"/>
+              <w:right w:type="dxa" w:w="90"/>
+            </w:tcMar>
+          </w:tcPr>
+          <w:p>
+            <w:pPr>
+              <w:spacing w:after="0" w:line="240"/>
+            </w:pPr>
+            <w:r>
+              <w:rPr>
+                <w:b w:val="false"/>
+                <w:bCs w:val="false"/>
+                <w:sz w:val="18"/>
+                <w:szCs w:val="18"/>
+              </w:rPr>
+              <w:t xml:space="preserve">2</w:t>
+            </w:r>
+          </w:p>
+        </w:tc>
+        <w:tc>
+          <w:tcPr>
+            <w:tcW w:type="dxa" w:w="1103"/>
+            <w:tcBorders>
+              <w:top w:val="single" w:color="000000" w:sz="4"/>
+              <w:left w:val="single" w:color="000000" w:sz="4"/>
+              <w:bottom w:val="single" w:color="000000" w:sz="4"/>
+              <w:right w:val="single" w:color="000000" w:sz="4"/>
+            </w:tcBorders>
+            <w:tcMar>
+              <w:top w:type="dxa" w:w="50"/>
+              <w:left w:type="dxa" w:w="90"/>
+              <w:bottom w:type="dxa" w:w="50"/>
+              <w:right w:type="dxa" w:w="90"/>
+            </w:tcMar>
+          </w:tcPr>
+          <w:p>
+            <w:pPr>
+              <w:spacing w:after="0" w:line="240"/>
+            </w:pPr>
+            <w:r>
+              <w:rPr>
+                <w:b w:val="false"/>
+                <w:bCs w:val="false"/>
+                <w:sz w:val="18"/>
+                <w:szCs w:val="18"/>
+              </w:rPr>
+              <w:t xml:space="preserve">7.1 s</w:t>
+            </w:r>
+          </w:p>
+        </w:tc>
+        <w:tc>
+          <w:tcPr>
+            <w:tcW w:type="dxa" w:w="1303"/>
+            <w:tcBorders>
+              <w:top w:val="single" w:color="000000" w:sz="4"/>
+              <w:left w:val="single" w:color="000000" w:sz="4"/>
+              <w:bottom w:val="single" w:color="000000" w:sz="4"/>
+              <w:right w:val="single" w:color="000000" w:sz="4"/>
+            </w:tcBorders>
+            <w:tcMar>
+              <w:top w:type="dxa" w:w="50"/>
+              <w:left w:type="dxa" w:w="90"/>
+              <w:bottom w:type="dxa" w:w="50"/>
+              <w:right w:type="dxa" w:w="90"/>
+            </w:tcMar>
+          </w:tcPr>
+          <w:p>
+            <w:pPr>
+              <w:spacing w:after="0" w:line="240"/>
+            </w:pPr>
+            <w:r>
+              <w:rPr>
+                <w:b w:val="false"/>
+                <w:bCs w:val="false"/>
+                <w:sz w:val="18"/>
+                <w:szCs w:val="18"/>
+              </w:rPr>
+              <w:t xml:space="preserve">4.9 ms</w:t>
+            </w:r>
+          </w:p>
+        </w:tc>
+        <w:tc>
+          <w:tcPr>
+            <w:tcW w:type="dxa" w:w="1303"/>
+            <w:tcBorders>
+              <w:top w:val="single" w:color="000000" w:sz="4"/>
+              <w:left w:val="single" w:color="000000" w:sz="4"/>
+              <w:bottom w:val="single" w:color="000000" w:sz="4"/>
+              <w:right w:val="single" w:color="000000" w:sz="4"/>
+            </w:tcBorders>
+            <w:tcMar>
+              <w:top w:type="dxa" w:w="50"/>
+              <w:left w:type="dxa" w:w="90"/>
+              <w:bottom w:type="dxa" w:w="50"/>
+              <w:right w:type="dxa" w:w="90"/>
+            </w:tcMar>
+          </w:tcPr>
+          <w:p>
+            <w:pPr>
+              <w:spacing w:after="0" w:line="240"/>
+            </w:pPr>
+            <w:r>
+              <w:rPr>
+                <w:b w:val="false"/>
+                <w:bCs w:val="false"/>
+                <w:sz w:val="18"/>
+                <w:szCs w:val="18"/>
+              </w:rPr>
+              <w:t xml:space="preserve">17.8 ms</w:t>
+            </w:r>
+          </w:p>
+        </w:tc>
+        <w:tc>
+          <w:tcPr>
+            <w:tcW w:type="dxa" w:w="1303"/>
+            <w:tcBorders>
+              <w:top w:val="single" w:color="000000" w:sz="4"/>
+              <w:left w:val="single" w:color="000000" w:sz="4"/>
+              <w:bottom w:val="single" w:color="000000" w:sz="4"/>
+              <w:right w:val="single" w:color="000000" w:sz="4"/>
+            </w:tcBorders>
+            <w:tcMar>
+              <w:top w:type="dxa" w:w="50"/>
+              <w:left w:type="dxa" w:w="90"/>
+              <w:bottom w:type="dxa" w:w="50"/>
+              <w:right w:type="dxa" w:w="90"/>
+            </w:tcMar>
+          </w:tcPr>
+          <w:p>
+            <w:pPr>
+              <w:spacing w:after="0" w:line="240"/>
+            </w:pPr>
+            <w:r>
+              <w:rPr>
+                <w:b w:val="false"/>
+                <w:bCs w:val="false"/>
+                <w:sz w:val="18"/>
+                <w:szCs w:val="18"/>
+              </w:rPr>
+              <w:t xml:space="preserve">29.9 ms</w:t>
+            </w:r>
+          </w:p>
+        </w:tc>
+        <w:tc>
+          <w:tcPr>
+            <w:tcW w:type="dxa" w:w="1303"/>
+            <w:tcBorders>
+              <w:top w:val="single" w:color="000000" w:sz="4"/>
+              <w:left w:val="single" w:color="000000" w:sz="4"/>
+              <w:bottom w:val="single" w:color="000000" w:sz="4"/>
+              <w:right w:val="single" w:color="000000" w:sz="4"/>
+            </w:tcBorders>
+            <w:tcMar>
+              <w:top w:type="dxa" w:w="50"/>
+              <w:left w:type="dxa" w:w="90"/>
+              <w:bottom w:type="dxa" w:w="50"/>
+              <w:right w:type="dxa" w:w="90"/>
+            </w:tcMar>
+          </w:tcPr>
+          <w:p>
+            <w:pPr>
+              <w:spacing w:after="0" w:line="240"/>
+            </w:pPr>
+            <w:r>
+              <w:rPr>
+                <w:b w:val="false"/>
+                <w:bCs w:val="false"/>
+                <w:sz w:val="18"/>
+                <w:szCs w:val="18"/>
+              </w:rPr>
+              <w:t xml:space="preserve">49.6 ms</w:t>
+            </w:r>
+          </w:p>
+        </w:tc>
+        <w:tc>
+          <w:tcPr>
+            <w:tcW w:type="dxa" w:w="2009"/>
+            <w:tcBorders>
+              <w:top w:val="single" w:color="000000" w:sz="4"/>
+              <w:left w:val="single" w:color="000000" w:sz="4"/>
+              <w:bottom w:val="single" w:color="000000" w:sz="4"/>
+              <w:right w:val="single" w:color="000000" w:sz="4"/>
+            </w:tcBorders>
+            <w:tcMar>
+              <w:top w:type="dxa" w:w="50"/>
+              <w:left w:type="dxa" w:w="90"/>
+              <w:bottom w:type="dxa" w:w="50"/>
+              <w:right w:type="dxa" w:w="90"/>
+            </w:tcMar>
+          </w:tcPr>
+          <w:p>
+            <w:pPr>
+              <w:spacing w:after="0" w:line="240"/>
+            </w:pPr>
+            <w:r>
+              <w:rPr>
+                <w:b w:val="false"/>
+                <w:bCs w:val="false"/>
+                <w:sz w:val="18"/>
+                <w:szCs w:val="18"/>
+              </w:rPr>
+              <w:t xml:space="preserve">134 ms</w:t>
+            </w:r>
+          </w:p>
+        </w:tc>
+      </w:tr>
+      <w:tr>
+        <w:trPr>
+          <w:cantSplit/>
+          <w:tblHeader w:val="off"/>
+        </w:trPr>
+        <w:tc>
+          <w:tcPr>
+            <w:tcW w:type="dxa" w:w="702"/>
+            <w:tcBorders>
+              <w:top w:val="single" w:color="000000" w:sz="4"/>
+              <w:left w:val="single" w:color="000000" w:sz="4"/>
+              <w:bottom w:val="single" w:color="000000" w:sz="4"/>
+              <w:right w:val="single" w:color="000000" w:sz="4"/>
+            </w:tcBorders>
+            <w:tcMar>
+              <w:top w:type="dxa" w:w="50"/>
+              <w:left w:type="dxa" w:w="90"/>
+              <w:bottom w:type="dxa" w:w="50"/>
+              <w:right w:type="dxa" w:w="90"/>
+            </w:tcMar>
+          </w:tcPr>
+          <w:p>
+            <w:pPr>
+              <w:spacing w:after="0" w:line="240"/>
+            </w:pPr>
+            <w:r>
+              <w:rPr>
+                <w:b w:val="false"/>
+                <w:bCs w:val="false"/>
+                <w:sz w:val="18"/>
+                <w:szCs w:val="18"/>
+              </w:rPr>
+              <w:t xml:space="preserve">3</w:t>
+            </w:r>
+          </w:p>
+        </w:tc>
+        <w:tc>
+          <w:tcPr>
+            <w:tcW w:type="dxa" w:w="1103"/>
+            <w:tcBorders>
+              <w:top w:val="single" w:color="000000" w:sz="4"/>
+              <w:left w:val="single" w:color="000000" w:sz="4"/>
+              <w:bottom w:val="single" w:color="000000" w:sz="4"/>
+              <w:right w:val="single" w:color="000000" w:sz="4"/>
+            </w:tcBorders>
+            <w:tcMar>
+              <w:top w:type="dxa" w:w="50"/>
+              <w:left w:type="dxa" w:w="90"/>
+              <w:bottom w:type="dxa" w:w="50"/>
+              <w:right w:type="dxa" w:w="90"/>
+            </w:tcMar>
+          </w:tcPr>
+          <w:p>
+            <w:pPr>
+              <w:spacing w:after="0" w:line="240"/>
+            </w:pPr>
+            <w:r>
+              <w:rPr>
+                <w:b w:val="false"/>
+                <w:bCs w:val="false"/>
+                <w:sz w:val="18"/>
+                <w:szCs w:val="18"/>
+              </w:rPr>
+              <w:t xml:space="preserve">7.7 s</w:t>
+            </w:r>
+          </w:p>
+        </w:tc>
+        <w:tc>
+          <w:tcPr>
+            <w:tcW w:type="dxa" w:w="1303"/>
+            <w:tcBorders>
+              <w:top w:val="single" w:color="000000" w:sz="4"/>
+              <w:left w:val="single" w:color="000000" w:sz="4"/>
+              <w:bottom w:val="single" w:color="000000" w:sz="4"/>
+              <w:right w:val="single" w:color="000000" w:sz="4"/>
+            </w:tcBorders>
+            <w:tcMar>
+              <w:top w:type="dxa" w:w="50"/>
+              <w:left w:type="dxa" w:w="90"/>
+              <w:bottom w:type="dxa" w:w="50"/>
+              <w:right w:type="dxa" w:w="90"/>
+            </w:tcMar>
+          </w:tcPr>
+          <w:p>
+            <w:pPr>
+              <w:spacing w:after="0" w:line="240"/>
+            </w:pPr>
+            <w:r>
+              <w:rPr>
+                <w:b w:val="false"/>
+                <w:bCs w:val="false"/>
+                <w:sz w:val="18"/>
+                <w:szCs w:val="18"/>
+              </w:rPr>
+              <w:t xml:space="preserve">5.3 ms</w:t>
+            </w:r>
+          </w:p>
+        </w:tc>
+        <w:tc>
+          <w:tcPr>
+            <w:tcW w:type="dxa" w:w="1303"/>
+            <w:tcBorders>
+              <w:top w:val="single" w:color="000000" w:sz="4"/>
+              <w:left w:val="single" w:color="000000" w:sz="4"/>
+              <w:bottom w:val="single" w:color="000000" w:sz="4"/>
+              <w:right w:val="single" w:color="000000" w:sz="4"/>
+            </w:tcBorders>
+            <w:tcMar>
+              <w:top w:type="dxa" w:w="50"/>
+              <w:left w:type="dxa" w:w="90"/>
+              <w:bottom w:type="dxa" w:w="50"/>
+              <w:right w:type="dxa" w:w="90"/>
+            </w:tcMar>
+          </w:tcPr>
+          <w:p>
+            <w:pPr>
+              <w:spacing w:after="0" w:line="240"/>
+            </w:pPr>
+            <w:r>
+              <w:rPr>
+                <w:b w:val="false"/>
+                <w:bCs w:val="false"/>
+                <w:sz w:val="18"/>
+                <w:szCs w:val="18"/>
+              </w:rPr>
+              <w:t xml:space="preserve">19.8 ms</w:t>
+            </w:r>
+          </w:p>
+        </w:tc>
+        <w:tc>
+          <w:tcPr>
+            <w:tcW w:type="dxa" w:w="1303"/>
+            <w:tcBorders>
+              <w:top w:val="single" w:color="000000" w:sz="4"/>
+              <w:left w:val="single" w:color="000000" w:sz="4"/>
+              <w:bottom w:val="single" w:color="000000" w:sz="4"/>
+              <w:right w:val="single" w:color="000000" w:sz="4"/>
+            </w:tcBorders>
+            <w:tcMar>
+              <w:top w:type="dxa" w:w="50"/>
+              <w:left w:type="dxa" w:w="90"/>
+              <w:bottom w:type="dxa" w:w="50"/>
+              <w:right w:type="dxa" w:w="90"/>
+            </w:tcMar>
+          </w:tcPr>
+          <w:p>
+            <w:pPr>
+              <w:spacing w:after="0" w:line="240"/>
+            </w:pPr>
+            <w:r>
+              <w:rPr>
+                <w:b w:val="false"/>
+                <w:bCs w:val="false"/>
+                <w:sz w:val="18"/>
+                <w:szCs w:val="18"/>
+              </w:rPr>
+              <w:t xml:space="preserve">32.2 ms</w:t>
+            </w:r>
+          </w:p>
+        </w:tc>
+        <w:tc>
+          <w:tcPr>
+            <w:tcW w:type="dxa" w:w="1303"/>
+            <w:tcBorders>
+              <w:top w:val="single" w:color="000000" w:sz="4"/>
+              <w:left w:val="single" w:color="000000" w:sz="4"/>
+              <w:bottom w:val="single" w:color="000000" w:sz="4"/>
+              <w:right w:val="single" w:color="000000" w:sz="4"/>
+            </w:tcBorders>
+            <w:tcMar>
+              <w:top w:type="dxa" w:w="50"/>
+              <w:left w:type="dxa" w:w="90"/>
+              <w:bottom w:type="dxa" w:w="50"/>
+              <w:right w:type="dxa" w:w="90"/>
+            </w:tcMar>
+          </w:tcPr>
+          <w:p>
+            <w:pPr>
+              <w:spacing w:after="0" w:line="240"/>
+            </w:pPr>
+            <w:r>
+              <w:rPr>
+                <w:b w:val="false"/>
+                <w:bCs w:val="false"/>
+                <w:sz w:val="18"/>
+                <w:szCs w:val="18"/>
+              </w:rPr>
+              <w:t xml:space="preserve">58.5 ms</w:t>
+            </w:r>
+          </w:p>
+        </w:tc>
+        <w:tc>
+          <w:tcPr>
+            <w:tcW w:type="dxa" w:w="2009"/>
+            <w:tcBorders>
+              <w:top w:val="single" w:color="000000" w:sz="4"/>
+              <w:left w:val="single" w:color="000000" w:sz="4"/>
+              <w:bottom w:val="single" w:color="000000" w:sz="4"/>
+              <w:right w:val="single" w:color="000000" w:sz="4"/>
+            </w:tcBorders>
+            <w:tcMar>
+              <w:top w:type="dxa" w:w="50"/>
+              <w:left w:type="dxa" w:w="90"/>
+              <w:bottom w:type="dxa" w:w="50"/>
+              <w:right w:type="dxa" w:w="90"/>
+            </w:tcMar>
+          </w:tcPr>
+          <w:p>
+            <w:pPr>
+              <w:spacing w:after="0" w:line="240"/>
+            </w:pPr>
+            <w:r>
+              <w:rPr>
+                <w:b w:val="false"/>
+                <w:bCs w:val="false"/>
+                <w:sz w:val="18"/>
+                <w:szCs w:val="18"/>
+              </w:rPr>
+              <w:t xml:space="preserve">132 ms</w:t>
             </w:r>
           </w:p>
         </w:tc>
@@ -20728,7 +21770,23 @@
         <w:jc w:val="both"/>
       </w:pPr>
       <w:r>
-        <w:t xml:space="preserve">The slowest single request varies between runs (112 ms and 308 ms in two runs with 100 in flight) because k6 and the whole system share one CPU. Running NGINX with 4 worker processes instead of 8 was also tried; it made no difference and was not kept.</w:t>
+        <w:rPr>
+          <w:b/>
+          <w:bCs/>
+        </w:rPr>
+        <w:t xml:space="preserve">The slowest request.</w:t>
+      </w:r>
+      <w:r>
+        <w:t xml:space="preserve"> 99.9% of requests finish in under 66 ms in every run, but the single slowest request ranges from about 130 ms to 828 ms. About 25 diagnostic runs that logged every request over 50 ms showed that every slow request was a "sold out" answer served from the API's memory, a path that takes about 5 ms. With Node's garbage-collection trace on, the longest pause in any API process during a burst was 10 ms. The slow requests come in clusters of 50 to 300 ms, sometimes on one API replica and sometimes on all of them at once: moments when the operating system pauses a process while about 20 busy processes share 8 cores. Freshly started API processes are also slower until their code is compiled. One unrecorded warm-up run right after the APIs restarted had p99.9 at 122 ms, and run 1 came right after an API replica rejoined the load balancer, which most likely explains its 828 ms.</w:t>
+      </w:r>
+    </w:p>
+    <w:p>
+      <w:pPr>
+        <w:spacing w:after="120" w:line="276"/>
+        <w:jc w:val="both"/>
+      </w:pPr>
+      <w:r>
+        <w:t xml:space="preserve">One change helped and was kept: RabbitMQ's Erlang schedulers were spinning while idle and using 1 to 1.6 cores, and are now told not to. This also made the burst faster (about 7.5 s instead of 9 s). Tried and not kept, because they made no clear difference or made it worse: 4 NGINX workers instead of 8, a larger Node young-generation heap, less frequent garbage collection in k6, higher CPU priority for the API, NGINX and Redis, and pinning containers to separate cores. Keeping the slowest request reliably under 100 ms needs the load generator on a separate machine.</w:t>
       </w:r>
     </w:p>
     <w:p>
@@ -24778,6 +25836,266 @@
           </w:p>
         </w:tc>
       </w:tr>
+      <w:tr>
+        <w:trPr>
+          <w:cantSplit/>
+          <w:tblHeader w:val="off"/>
+        </w:trPr>
+        <w:tc>
+          <w:tcPr>
+            <w:tcW w:type="dxa" w:w="501"/>
+            <w:tcBorders>
+              <w:top w:val="single" w:color="000000" w:sz="4"/>
+              <w:left w:val="single" w:color="000000" w:sz="4"/>
+              <w:bottom w:val="single" w:color="000000" w:sz="4"/>
+              <w:right w:val="single" w:color="000000" w:sz="4"/>
+            </w:tcBorders>
+            <w:tcMar>
+              <w:top w:type="dxa" w:w="50"/>
+              <w:left w:type="dxa" w:w="90"/>
+              <w:bottom w:type="dxa" w:w="50"/>
+              <w:right w:type="dxa" w:w="90"/>
+            </w:tcMar>
+          </w:tcPr>
+          <w:p>
+            <w:pPr>
+              <w:spacing w:after="0" w:line="240"/>
+            </w:pPr>
+            <w:r>
+              <w:rPr>
+                <w:b w:val="false"/>
+                <w:bCs w:val="false"/>
+                <w:sz w:val="20"/>
+                <w:szCs w:val="20"/>
+              </w:rPr>
+              <w:t xml:space="preserve">5</w:t>
+            </w:r>
+          </w:p>
+        </w:tc>
+        <w:tc>
+          <w:tcPr>
+            <w:tcW w:type="dxa" w:w="3510"/>
+            <w:tcBorders>
+              <w:top w:val="single" w:color="000000" w:sz="4"/>
+              <w:left w:val="single" w:color="000000" w:sz="4"/>
+              <w:bottom w:val="single" w:color="000000" w:sz="4"/>
+              <w:right w:val="single" w:color="000000" w:sz="4"/>
+            </w:tcBorders>
+            <w:tcMar>
+              <w:top w:type="dxa" w:w="50"/>
+              <w:left w:type="dxa" w:w="90"/>
+              <w:bottom w:type="dxa" w:w="50"/>
+              <w:right w:type="dxa" w:w="90"/>
+            </w:tcMar>
+          </w:tcPr>
+          <w:p>
+            <w:pPr>
+              <w:spacing w:after="0" w:line="240"/>
+            </w:pPr>
+            <w:r>
+              <w:rPr>
+                <w:b w:val="false"/>
+                <w:bCs w:val="false"/>
+                <w:sz w:val="20"/>
+                <w:szCs w:val="20"/>
+              </w:rPr>
+              <w:t xml:space="preserve">After a RabbitMQ restart the workers stayed up but consumed nothing, so orders stayed in the queue</w:t>
+            </w:r>
+          </w:p>
+        </w:tc>
+        <w:tc>
+          <w:tcPr>
+            <w:tcW w:type="dxa" w:w="1805"/>
+            <w:tcBorders>
+              <w:top w:val="single" w:color="000000" w:sz="4"/>
+              <w:left w:val="single" w:color="000000" w:sz="4"/>
+              <w:bottom w:val="single" w:color="000000" w:sz="4"/>
+              <w:right w:val="single" w:color="000000" w:sz="4"/>
+            </w:tcBorders>
+            <w:tcMar>
+              <w:top w:type="dxa" w:w="50"/>
+              <w:left w:type="dxa" w:w="90"/>
+              <w:bottom w:type="dxa" w:w="50"/>
+              <w:right w:type="dxa" w:w="90"/>
+            </w:tcMar>
+          </w:tcPr>
+          <w:p>
+            <w:pPr>
+              <w:spacing w:after="0" w:line="240"/>
+            </w:pPr>
+            <w:r>
+              <w:rPr>
+                <w:b w:val="false"/>
+                <w:bCs w:val="false"/>
+                <w:sz w:val="20"/>
+                <w:szCs w:val="20"/>
+              </w:rPr>
+              <w:t xml:space="preserve">Latency diagnostics; then the RabbitMQ restart test (0 consumers)</w:t>
+            </w:r>
+          </w:p>
+        </w:tc>
+        <w:tc>
+          <w:tcPr>
+            <w:tcW w:type="dxa" w:w="3210"/>
+            <w:tcBorders>
+              <w:top w:val="single" w:color="000000" w:sz="4"/>
+              <w:left w:val="single" w:color="000000" w:sz="4"/>
+              <w:bottom w:val="single" w:color="000000" w:sz="4"/>
+              <w:right w:val="single" w:color="000000" w:sz="4"/>
+            </w:tcBorders>
+            <w:tcMar>
+              <w:top w:type="dxa" w:w="50"/>
+              <w:left w:type="dxa" w:w="90"/>
+              <w:bottom w:type="dxa" w:w="50"/>
+              <w:right w:type="dxa" w:w="90"/>
+            </w:tcMar>
+          </w:tcPr>
+          <w:p>
+            <w:pPr>
+              <w:spacing w:after="0" w:line="240"/>
+            </w:pPr>
+            <w:r>
+              <w:rPr>
+                <w:b w:val="false"/>
+                <w:bCs w:val="false"/>
+                <w:sz w:val="20"/>
+                <w:szCs w:val="20"/>
+              </w:rPr>
+              <w:t xml:space="preserve">Worker exits on a lost connection and Docker restarts it; test tests/resilience/rabbitmq-restart.sh added to CI</w:t>
+            </w:r>
+          </w:p>
+        </w:tc>
+      </w:tr>
+      <w:tr>
+        <w:trPr>
+          <w:cantSplit/>
+          <w:tblHeader w:val="off"/>
+        </w:trPr>
+        <w:tc>
+          <w:tcPr>
+            <w:tcW w:type="dxa" w:w="501"/>
+            <w:tcBorders>
+              <w:top w:val="single" w:color="000000" w:sz="4"/>
+              <w:left w:val="single" w:color="000000" w:sz="4"/>
+              <w:bottom w:val="single" w:color="000000" w:sz="4"/>
+              <w:right w:val="single" w:color="000000" w:sz="4"/>
+            </w:tcBorders>
+            <w:tcMar>
+              <w:top w:type="dxa" w:w="50"/>
+              <w:left w:type="dxa" w:w="90"/>
+              <w:bottom w:type="dxa" w:w="50"/>
+              <w:right w:type="dxa" w:w="90"/>
+            </w:tcMar>
+          </w:tcPr>
+          <w:p>
+            <w:pPr>
+              <w:spacing w:after="0" w:line="240"/>
+            </w:pPr>
+            <w:r>
+              <w:rPr>
+                <w:b w:val="false"/>
+                <w:bCs w:val="false"/>
+                <w:sz w:val="20"/>
+                <w:szCs w:val="20"/>
+              </w:rPr>
+              <w:t xml:space="preserve">6</w:t>
+            </w:r>
+          </w:p>
+        </w:tc>
+        <w:tc>
+          <w:tcPr>
+            <w:tcW w:type="dxa" w:w="3510"/>
+            <w:tcBorders>
+              <w:top w:val="single" w:color="000000" w:sz="4"/>
+              <w:left w:val="single" w:color="000000" w:sz="4"/>
+              <w:bottom w:val="single" w:color="000000" w:sz="4"/>
+              <w:right w:val="single" w:color="000000" w:sz="4"/>
+            </w:tcBorders>
+            <w:tcMar>
+              <w:top w:type="dxa" w:w="50"/>
+              <w:left w:type="dxa" w:w="90"/>
+              <w:bottom w:type="dxa" w:w="50"/>
+              <w:right w:type="dxa" w:w="90"/>
+            </w:tcMar>
+          </w:tcPr>
+          <w:p>
+            <w:pPr>
+              <w:spacing w:after="0" w:line="240"/>
+            </w:pPr>
+            <w:r>
+              <w:rPr>
+                <w:b w:val="false"/>
+                <w:bCs w:val="false"/>
+                <w:sz w:val="20"/>
+                <w:szCs w:val="20"/>
+              </w:rPr>
+              <w:t xml:space="preserve">NGINX resolves the api name once at startup; an API container that restarts on a new IP gets no traffic until the gateway restarts. No requests fail, but load spreads over fewer replicas</w:t>
+            </w:r>
+          </w:p>
+        </w:tc>
+        <w:tc>
+          <w:tcPr>
+            <w:tcW w:type="dxa" w:w="1805"/>
+            <w:tcBorders>
+              <w:top w:val="single" w:color="000000" w:sz="4"/>
+              <w:left w:val="single" w:color="000000" w:sz="4"/>
+              <w:bottom w:val="single" w:color="000000" w:sz="4"/>
+              <w:right w:val="single" w:color="000000" w:sz="4"/>
+            </w:tcBorders>
+            <w:tcMar>
+              <w:top w:type="dxa" w:w="50"/>
+              <w:left w:type="dxa" w:w="90"/>
+              <w:bottom w:type="dxa" w:w="50"/>
+              <w:right w:type="dxa" w:w="90"/>
+            </w:tcMar>
+          </w:tcPr>
+          <w:p>
+            <w:pPr>
+              <w:spacing w:after="0" w:line="240"/>
+            </w:pPr>
+            <w:r>
+              <w:rPr>
+                <w:b w:val="false"/>
+                <w:bCs w:val="false"/>
+                <w:sz w:val="20"/>
+                <w:szCs w:val="20"/>
+              </w:rPr>
+              <w:t xml:space="preserve">k6 run showing 3 replicas instead of 4</w:t>
+            </w:r>
+          </w:p>
+        </w:tc>
+        <w:tc>
+          <w:tcPr>
+            <w:tcW w:type="dxa" w:w="3210"/>
+            <w:tcBorders>
+              <w:top w:val="single" w:color="000000" w:sz="4"/>
+              <w:left w:val="single" w:color="000000" w:sz="4"/>
+              <w:bottom w:val="single" w:color="000000" w:sz="4"/>
+              <w:right w:val="single" w:color="000000" w:sz="4"/>
+            </w:tcBorders>
+            <w:tcMar>
+              <w:top w:type="dxa" w:w="50"/>
+              <w:left w:type="dxa" w:w="90"/>
+              <w:bottom w:type="dxa" w:w="50"/>
+              <w:right w:type="dxa" w:w="90"/>
+            </w:tcMar>
+          </w:tcPr>
+          <w:p>
+            <w:pPr>
+              <w:spacing w:after="0" w:line="240"/>
+            </w:pPr>
+            <w:r>
+              <w:rPr>
+                <w:b w:val="false"/>
+                <w:bCs w:val="false"/>
+                <w:sz w:val="20"/>
+                <w:szCs w:val="20"/>
+              </w:rPr>
+              <w:t xml:space="preserve">Not fixed yet. Fix: resolver 127.0.0.11 and resolve on the upstream server</w:t>
+            </w:r>
+          </w:p>
+        </w:tc>
+      </w:tr>
     </w:tbl>
     <w:p>
       <w:pPr>
@@ -26142,7 +27460,7 @@
                 <w:sz w:val="20"/>
                 <w:szCs w:val="20"/>
               </w:rPr>
-              <w:t xml:space="preserve">25,003 to 25,009 requests per replica</w:t>
+              <w:t xml:space="preserve">25,004 to 25,010 requests per replica</w:t>
             </w:r>
           </w:p>
         </w:tc>
@@ -26439,7 +27757,7 @@
                 <w:sz w:val="20"/>
                 <w:szCs w:val="20"/>
               </w:rPr>
-              <w:t xml:space="preserve">p95 24.9 ms at about 11,000 requests/s</w:t>
+              <w:t xml:space="preserve">p95 18.5 ms, p99.9 65.2 ms at about 13,900 requests/s</w:t>
             </w:r>
           </w:p>
         </w:tc>
@@ -28467,6 +29785,46 @@
           <w:b/>
           <w:bCs/>
         </w:rPr>
+        <w:t xml:space="preserve">One machine for everything</w:t>
+      </w:r>
+      <w:r>
+        <w:t xml:space="preserve">: the load generator shares 8 cores with the system it tests. The 99.9th percentile is stable, but the single slowest request (about 130 ms to 828 ms) reflects operating-system scheduling on this laptop rather than the application.</w:t>
+      </w:r>
+    </w:p>
+    <w:p>
+      <w:pPr>
+        <w:pStyle w:val="ListParagraph"/>
+        <w:numPr>
+          <w:ilvl w:val="0"/>
+          <w:numId w:val="2"/>
+        </w:numPr>
+        <w:spacing w:after="60" w:line="276"/>
+      </w:pPr>
+      <w:r>
+        <w:rPr>
+          <w:b/>
+          <w:bCs/>
+        </w:rPr>
+        <w:t xml:space="preserve">NGINX DNS</w:t>
+      </w:r>
+      <w:r>
+        <w:t xml:space="preserve">: the gateway resolves the API replicas once at startup, so a replica that restarts on a new IP is left out until the gateway restarts (defect 6 in section 8.9).</w:t>
+      </w:r>
+    </w:p>
+    <w:p>
+      <w:pPr>
+        <w:pStyle w:val="ListParagraph"/>
+        <w:numPr>
+          <w:ilvl w:val="0"/>
+          <w:numId w:val="2"/>
+        </w:numPr>
+        <w:spacing w:after="60" w:line="276"/>
+      </w:pPr>
+      <w:r>
+        <w:rPr>
+          <w:b/>
+          <w:bCs/>
+        </w:rPr>
         <w:t xml:space="preserve">Load figures</w:t>
       </w:r>
       <w:r>
@@ -28841,6 +30199,60 @@
           <w:sz w:val="16"/>
           <w:szCs w:val="16"/>
         </w:rPr>
+        <w:t xml:space="preserve"># Order pipeline survives a RabbitMQ restart</w:t>
+      </w:r>
+    </w:p>
+    <w:p>
+      <w:pPr>
+        <w:pBdr>
+          <w:left w:val="single" w:color="000000" w:sz="4" w:space="6"/>
+          <w:right w:val="single" w:color="000000" w:sz="4" w:space="6"/>
+        </w:pBdr>
+        <w:spacing w:after="0" w:line="228"/>
+        <w:ind w:left="140" w:right="140"/>
+      </w:pPr>
+      <w:r>
+        <w:rPr>
+          <w:rFonts w:ascii="Courier New" w:cs="Courier New" w:eastAsia="Courier New" w:hAnsi="Courier New"/>
+          <w:sz w:val="16"/>
+          <w:szCs w:val="16"/>
+        </w:rPr>
+        <w:t xml:space="preserve">bash tests/resilience/rabbitmq-restart.sh</w:t>
+      </w:r>
+    </w:p>
+    <w:p>
+      <w:pPr>
+        <w:pBdr>
+          <w:left w:val="single" w:color="000000" w:sz="4" w:space="6"/>
+          <w:right w:val="single" w:color="000000" w:sz="4" w:space="6"/>
+        </w:pBdr>
+        <w:spacing w:after="0" w:line="228"/>
+        <w:ind w:left="140" w:right="140"/>
+      </w:pPr>
+      <w:r>
+        <w:rPr>
+          <w:rFonts w:ascii="Courier New" w:cs="Courier New" w:eastAsia="Courier New" w:hAnsi="Courier New"/>
+          <w:sz w:val="16"/>
+          <w:szCs w:val="16"/>
+        </w:rPr>
+        <w:t xml:space="preserve"> </w:t>
+      </w:r>
+    </w:p>
+    <w:p>
+      <w:pPr>
+        <w:pBdr>
+          <w:left w:val="single" w:color="000000" w:sz="4" w:space="6"/>
+          <w:right w:val="single" w:color="000000" w:sz="4" w:space="6"/>
+        </w:pBdr>
+        <w:spacing w:after="0" w:line="228"/>
+        <w:ind w:left="140" w:right="140"/>
+      </w:pPr>
+      <w:r>
+        <w:rPr>
+          <w:rFonts w:ascii="Courier New" w:cs="Courier New" w:eastAsia="Courier New" w:hAnsi="Courier New"/>
+          <w:sz w:val="16"/>
+          <w:szCs w:val="16"/>
+        </w:rPr>
         <w:t xml:space="preserve"># Browser tests</w:t>
       </w:r>
     </w:p>
@@ -29182,6 +30594,24 @@
           <w:szCs w:val="16"/>
         </w:rPr>
         <w:t xml:space="preserve">tests/e2e/    Playwright tests and screenshot script</w:t>
+      </w:r>
+    </w:p>
+    <w:p>
+      <w:pPr>
+        <w:pBdr>
+          <w:left w:val="single" w:color="000000" w:sz="4" w:space="6"/>
+          <w:right w:val="single" w:color="000000" w:sz="4" w:space="6"/>
+        </w:pBdr>
+        <w:spacing w:after="0" w:line="228"/>
+        <w:ind w:left="140" w:right="140"/>
+      </w:pPr>
+      <w:r>
+        <w:rPr>
+          <w:rFonts w:ascii="Courier New" w:cs="Courier New" w:eastAsia="Courier New" w:hAnsi="Courier New"/>
+          <w:sz w:val="16"/>
+          <w:szCs w:val="16"/>
+        </w:rPr>
+        <w:t xml:space="preserve">tests/resilience/  RabbitMQ restart test</w:t>
       </w:r>
     </w:p>
     <w:p>
@@ -29642,6 +31072,74 @@
                 <w:sz w:val="20"/>
                 <w:szCs w:val="20"/>
               </w:rPr>
+              <w:t xml:space="preserve">evidence/k6/flash-sale-run-2.txt, -3.txt and summary-2/3.json</w:t>
+            </w:r>
+          </w:p>
+        </w:tc>
+        <w:tc>
+          <w:tcPr>
+            <w:tcW w:type="dxa" w:w="4714"/>
+            <w:tcBorders>
+              <w:top w:val="single" w:color="000000" w:sz="4"/>
+              <w:left w:val="single" w:color="000000" w:sz="4"/>
+              <w:bottom w:val="single" w:color="000000" w:sz="4"/>
+              <w:right w:val="single" w:color="000000" w:sz="4"/>
+            </w:tcBorders>
+            <w:tcMar>
+              <w:top w:type="dxa" w:w="50"/>
+              <w:left w:type="dxa" w:w="90"/>
+              <w:bottom w:type="dxa" w:w="50"/>
+              <w:right w:type="dxa" w:w="90"/>
+            </w:tcMar>
+          </w:tcPr>
+          <w:p>
+            <w:pPr>
+              <w:spacing w:after="0" w:line="240"/>
+            </w:pPr>
+            <w:r>
+              <w:rPr>
+                <w:b w:val="false"/>
+                <w:bCs w:val="false"/>
+                <w:sz w:val="20"/>
+                <w:szCs w:val="20"/>
+              </w:rPr>
+              <w:t xml:space="preserve">Runs 2 and 3 of the final configuration</w:t>
+            </w:r>
+          </w:p>
+        </w:tc>
+      </w:tr>
+      <w:tr>
+        <w:trPr>
+          <w:cantSplit/>
+          <w:tblHeader w:val="off"/>
+        </w:trPr>
+        <w:tc>
+          <w:tcPr>
+            <w:tcW w:type="dxa" w:w="4312"/>
+            <w:tcBorders>
+              <w:top w:val="single" w:color="000000" w:sz="4"/>
+              <w:left w:val="single" w:color="000000" w:sz="4"/>
+              <w:bottom w:val="single" w:color="000000" w:sz="4"/>
+              <w:right w:val="single" w:color="000000" w:sz="4"/>
+            </w:tcBorders>
+            <w:tcMar>
+              <w:top w:type="dxa" w:w="50"/>
+              <w:left w:type="dxa" w:w="90"/>
+              <w:bottom w:type="dxa" w:w="50"/>
+              <w:right w:type="dxa" w:w="90"/>
+            </w:tcMar>
+          </w:tcPr>
+          <w:p>
+            <w:pPr>
+              <w:spacing w:after="0" w:line="240"/>
+            </w:pPr>
+            <w:r>
+              <w:rPr>
+                <w:b w:val="false"/>
+                <w:bCs w:val="false"/>
+                <w:sz w:val="20"/>
+                <w:szCs w:val="20"/>
+              </w:rPr>
               <w:t xml:space="preserve">evidence/k6/flash-sale-run-1200vus.txt, flash-sale-summary-1200vus.json</w:t>
             </w:r>
           </w:p>
@@ -29674,6 +31172,74 @@
                 <w:szCs w:val="20"/>
               </w:rPr>
               <w:t xml:space="preserve">Earlier 100,000-request run with 1,200 requests in flight</w:t>
+            </w:r>
+          </w:p>
+        </w:tc>
+      </w:tr>
+      <w:tr>
+        <w:trPr>
+          <w:cantSplit/>
+          <w:tblHeader w:val="off"/>
+        </w:trPr>
+        <w:tc>
+          <w:tcPr>
+            <w:tcW w:type="dxa" w:w="4312"/>
+            <w:tcBorders>
+              <w:top w:val="single" w:color="000000" w:sz="4"/>
+              <w:left w:val="single" w:color="000000" w:sz="4"/>
+              <w:bottom w:val="single" w:color="000000" w:sz="4"/>
+              <w:right w:val="single" w:color="000000" w:sz="4"/>
+            </w:tcBorders>
+            <w:tcMar>
+              <w:top w:type="dxa" w:w="50"/>
+              <w:left w:type="dxa" w:w="90"/>
+              <w:bottom w:type="dxa" w:w="50"/>
+              <w:right w:type="dxa" w:w="90"/>
+            </w:tcMar>
+          </w:tcPr>
+          <w:p>
+            <w:pPr>
+              <w:spacing w:after="0" w:line="240"/>
+            </w:pPr>
+            <w:r>
+              <w:rPr>
+                <w:b w:val="false"/>
+                <w:bCs w:val="false"/>
+                <w:sz w:val="20"/>
+                <w:szCs w:val="20"/>
+              </w:rPr>
+              <w:t xml:space="preserve">evidence/resilience/rabbitmq-restart-run.txt</w:t>
+            </w:r>
+          </w:p>
+        </w:tc>
+        <w:tc>
+          <w:tcPr>
+            <w:tcW w:type="dxa" w:w="4714"/>
+            <w:tcBorders>
+              <w:top w:val="single" w:color="000000" w:sz="4"/>
+              <w:left w:val="single" w:color="000000" w:sz="4"/>
+              <w:bottom w:val="single" w:color="000000" w:sz="4"/>
+              <w:right w:val="single" w:color="000000" w:sz="4"/>
+            </w:tcBorders>
+            <w:tcMar>
+              <w:top w:type="dxa" w:w="50"/>
+              <w:left w:type="dxa" w:w="90"/>
+              <w:bottom w:type="dxa" w:w="50"/>
+              <w:right w:type="dxa" w:w="90"/>
+            </w:tcMar>
+          </w:tcPr>
+          <w:p>
+            <w:pPr>
+              <w:spacing w:after="0" w:line="240"/>
+            </w:pPr>
+            <w:r>
+              <w:rPr>
+                <w:b w:val="false"/>
+                <w:bCs w:val="false"/>
+                <w:sz w:val="20"/>
+                <w:szCs w:val="20"/>
+              </w:rPr>
+              <w:t xml:space="preserve">Output of the RabbitMQ restart test</w:t>
             </w:r>
           </w:p>
         </w:tc>

</xml_diff>

<commit_message>
Redesign storefront as a plain white product page; refresh screenshots and report
Product page layout with image, details and a buy box, white background,
serif system font, colours only for state (in stock, deal, errors) and the
buy button. New product image. All app screenshots, the Ops screenshots under
load, the naive-strategy screenshot and Lighthouse were captured again on the
new UI (mobile TTI 1.43 s, bundle 47.5 KB raw).
</commit_message>
<xml_diff>
--- a/report/Flash_Sale_Technical_Report.docx
+++ b/report/Flash_Sale_Technical_Report.docx
@@ -1399,7 +1399,7 @@
                 <w:sz w:val="20"/>
                 <w:szCs w:val="20"/>
               </w:rPr>
-              <w:t xml:space="preserve">45.3 KB raw, 17.5 KB gzipped (JS + CSS)</w:t>
+              <w:t xml:space="preserve">47.5 KB raw, 18.0 KB gzipped (JS + CSS)</w:t>
             </w:r>
           </w:p>
         </w:tc>
@@ -1529,7 +1529,7 @@
                 <w:sz w:val="20"/>
                 <w:szCs w:val="20"/>
               </w:rPr>
-              <w:t xml:space="preserve">1.4 s on Lighthouse mobile (throttled), 0.4 s on desktop</w:t>
+              <w:t xml:space="preserve">1.4 s on Lighthouse mobile (throttled), 0.3 s on desktop</w:t>
             </w:r>
           </w:p>
         </w:tc>
@@ -7880,7 +7880,7 @@
         <w:jc w:val="both"/>
       </w:pPr>
       <w:r>
-        <w:t xml:space="preserve">With React DOM the first build was 240 KB raw (76 KB gzipped): under the budget when gzipped, but over it when measured raw. The same code built with Preact's compatibility layer is 45.3 KB raw and 17.5 KB gzipped, which meets the budget under either reading. The build fails automatically if the budget is exceeded (</w:t>
+        <w:t xml:space="preserve">With React DOM the first build was 240 KB raw (76 KB gzipped): under the budget when gzipped, but over it when measured raw. The same code built with Preact's compatibility layer is 47.5 KB raw and 18.0 KB gzipped, which meets the budget under either reading. The build fails automatically if the budget is exceeded (</w:t>
       </w:r>
       <w:r>
         <w:rPr>
@@ -7924,7 +7924,7 @@
           <w:sz w:val="16"/>
           <w:szCs w:val="16"/>
         </w:rPr>
-        <w:t xml:space="preserve">index-BAs5BpWp.js                           35.0 KB    13.7 KB gz</w:t>
+        <w:t xml:space="preserve">index-6ypcXpFH.css                           6.7 KB     2.1 KB gz</w:t>
       </w:r>
     </w:p>
     <w:p>
@@ -7942,7 +7942,7 @@
           <w:sz w:val="16"/>
           <w:szCs w:val="16"/>
         </w:rPr>
-        <w:t xml:space="preserve">index-DyzFaKnw.css                           5.9 KB     1.9 KB gz</w:t>
+        <w:t xml:space="preserve">index-DgEHKYwG.js                           36.3 KB    14.1 KB gz</w:t>
       </w:r>
     </w:p>
     <w:p>
@@ -7960,7 +7960,7 @@
           <w:sz w:val="16"/>
           <w:szCs w:val="16"/>
         </w:rPr>
-        <w:t xml:space="preserve">Ops-DwSs6OKm.js                              4.5 KB     1.9 KB gz</w:t>
+        <w:t xml:space="preserve">Ops-BYtGjagg.js                              4.5 KB     1.9 KB gz</w:t>
       </w:r>
     </w:p>
     <w:p>
@@ -7979,7 +7979,7 @@
           <w:sz w:val="16"/>
           <w:szCs w:val="16"/>
         </w:rPr>
-        <w:t xml:space="preserve">total: 45.3 KB raw, 17.5 KB gzipped (budget 200 KB raw)</w:t>
+        <w:t xml:space="preserve">total: 47.5 KB raw, 18.0 KB gzipped (budget 200 KB raw)</w:t>
       </w:r>
     </w:p>
     <w:p>
@@ -14749,7 +14749,7 @@
                 <w:sz w:val="20"/>
                 <w:szCs w:val="20"/>
               </w:rPr>
-              <w:t xml:space="preserve">45.3 KB raw (budget 200 KB)</w:t>
+              <w:t xml:space="preserve">47.5 KB raw (budget 200 KB)</w:t>
             </w:r>
           </w:p>
         </w:tc>
@@ -21795,7 +21795,18 @@
         <w:jc w:val="both"/>
       </w:pPr>
       <w:r>
-        <w:t xml:space="preserve">The ops-page screenshots in this section and in section 8.5 were taken during the earlier runs with 1,200 requests in flight, before the final UI update that changed the accent colours from red and green to blue and lime. Only the colours differ from the current UI; the numbers shown are the ones recorded during those runs.</w:t>
+        <w:t xml:space="preserve">The ops-page screenshots below were taken during a separate 100,000-request run with Chrome capturing the page at the same time (</w:t>
+      </w:r>
+      <w:r>
+        <w:rPr>
+          <w:rFonts w:ascii="Courier New" w:cs="Courier New" w:eastAsia="Courier New" w:hAnsi="Courier New"/>
+          <w:sz w:val="21"/>
+          <w:szCs w:val="21"/>
+        </w:rPr>
+        <w:t xml:space="preserve">evidence/k6/flash-sale-run-while-screenshotting.txt</w:t>
+      </w:r>
+      <w:r>
+        <w:t xml:space="preserve">). With the browser also using CPU, that run took 10.8 s and its p99.9 was 102 ms, missing the 100 ms threshold by 2 ms; it still had exactly 500 orders and stock 0 in Redis and PostgreSQL.</w:t>
       </w:r>
     </w:p>
     <w:p>
@@ -21807,9 +21818,9 @@
       <w:r>
         <w:drawing>
           <wp:inline distT="0" distB="0" distL="0" distR="0">
-            <wp:extent cx="5667375" cy="5153025"/>
+            <wp:extent cx="5667375" cy="5095875"/>
             <wp:effectExtent t="0" r="0" b="0" l="0"/>
-            <wp:docPr id="2" name="figure-2" descr="Ops page during the 100,000-request run recorded while screenshotting (1,200 requests in flight): peak 8,328 requests per second, 500 confirmed orders, Redis and database stock both 0, nothing oversold" title="Ops page during the 100,000-request run recorded while screenshotting (1,200 requests in flight): peak 8,328 requests per second, 500 confirmed orders, Redis and database stock both 0, nothing oversold"/>
+            <wp:docPr id="2" name="figure-2" descr="Ops page a few seconds into the 100,000-request run: about 17,800 checkout responses so far, all 500 units already confirmed in the database, Redis and database stock both 0, queue empty, nothing oversold" title="Ops page a few seconds into the 100,000-request run: about 17,800 checkout responses so far, all 500 units already confirmed in the database, Redis and database stock both 0, queue empty, nothing oversold"/>
             <wp:cNvGraphicFramePr>
               <a:graphicFrameLocks xmlns:a="http://schemas.openxmlformats.org/drawingml/2006/main" noChangeAspect="1"/>
             </wp:cNvGraphicFramePr>
@@ -21832,7 +21843,7 @@
                   <pic:spPr bwMode="auto">
                     <a:xfrm>
                       <a:off x="0" y="0"/>
-                      <a:ext cx="5667375" cy="5153025"/>
+                      <a:ext cx="5667375" cy="5095875"/>
                     </a:xfrm>
                     <a:prstGeom prst="rect">
                       <a:avLst/>
@@ -21857,7 +21868,7 @@
           <w:sz w:val="20"/>
           <w:szCs w:val="20"/>
         </w:rPr>
-        <w:t xml:space="preserve">Figure 2: Ops page during the 100,000-request run recorded while screenshotting (1,200 requests in flight): peak 8,328 requests per second, 500 confirmed orders, Redis and database stock both 0, nothing oversold</w:t>
+        <w:t xml:space="preserve">Figure 2: Ops page a few seconds into the 100,000-request run: about 17,800 checkout responses so far, all 500 units already confirmed in the database, Redis and database stock both 0, queue empty, nothing oversold</w:t>
       </w:r>
     </w:p>
     <w:p>
@@ -21869,9 +21880,9 @@
       <w:r>
         <w:drawing>
           <wp:inline distT="0" distB="0" distL="0" distR="0">
-            <wp:extent cx="5667375" cy="5153025"/>
+            <wp:extent cx="5667375" cy="5095875"/>
             <wp:effectExtent t="0" r="0" b="0" l="0"/>
-            <wp:docPr id="3" name="figure-3" descr="Ops page after the same run: queue drained, no dead letters, requests spread evenly over four API replicas" title="Ops page after the same run: queue drained, no dead letters, requests spread evenly over four API replicas"/>
+            <wp:docPr id="3" name="figure-3" descr="Ops page after the same run: peak 12,981 requests per second, 500 confirmed orders, no dead letters, requests spread evenly over four API replicas (25,000 to 25,011 each)" title="Ops page after the same run: peak 12,981 requests per second, 500 confirmed orders, no dead letters, requests spread evenly over four API replicas (25,000 to 25,011 each)"/>
             <wp:cNvGraphicFramePr>
               <a:graphicFrameLocks xmlns:a="http://schemas.openxmlformats.org/drawingml/2006/main" noChangeAspect="1"/>
             </wp:cNvGraphicFramePr>
@@ -21894,7 +21905,7 @@
                   <pic:spPr bwMode="auto">
                     <a:xfrm>
                       <a:off x="0" y="0"/>
-                      <a:ext cx="5667375" cy="5153025"/>
+                      <a:ext cx="5667375" cy="5095875"/>
                     </a:xfrm>
                     <a:prstGeom prst="rect">
                       <a:avLst/>
@@ -21919,7 +21930,7 @@
           <w:sz w:val="20"/>
           <w:szCs w:val="20"/>
         </w:rPr>
-        <w:t xml:space="preserve">Figure 3: Ops page after the same run: queue drained, no dead letters, requests spread evenly over four API replicas</w:t>
+        <w:t xml:space="preserve">Figure 3: Ops page after the same run: peak 12,981 requests per second, 500 confirmed orders, no dead letters, requests spread evenly over four API replicas (25,000 to 25,011 each)</w:t>
       </w:r>
     </w:p>
     <w:p>
@@ -23376,9 +23387,9 @@
       <w:r>
         <w:drawing>
           <wp:inline distT="0" distB="0" distL="0" distR="0">
-            <wp:extent cx="5667375" cy="5153025"/>
+            <wp:extent cx="5667375" cy="5095875"/>
             <wp:effectExtent t="0" r="0" b="0" l="0"/>
-            <wp:docPr id="4" name="figure-4" descr="Ops page after a run with the naive strategy: 2,000 orders confirmed for 500 units (+1,500 oversold) while the database still shows 479 in stock, the lost-update bug. Redis shows 500 because the naive path does not use Redis." title="Ops page after a run with the naive strategy: 2,000 orders confirmed for 500 units (+1,500 oversold) while the database still shows 479 in stock, the lost-update bug. Redis shows 500 because the naive path does not use Redis."/>
+            <wp:docPr id="4" name="figure-4" descr="Ops page after a run with the naive strategy: 5,000 orders confirmed for 500 units (+4,500 oversold) while the database still shows 436 in stock, the lost-update bug. Redis shows 500 because the naive path does not use Redis." title="Ops page after a run with the naive strategy: 5,000 orders confirmed for 500 units (+4,500 oversold) while the database still shows 436 in stock, the lost-update bug. Redis shows 500 because the naive path does not use Redis."/>
             <wp:cNvGraphicFramePr>
               <a:graphicFrameLocks xmlns:a="http://schemas.openxmlformats.org/drawingml/2006/main" noChangeAspect="1"/>
             </wp:cNvGraphicFramePr>
@@ -23401,7 +23412,7 @@
                   <pic:spPr bwMode="auto">
                     <a:xfrm>
                       <a:off x="0" y="0"/>
-                      <a:ext cx="5667375" cy="5153025"/>
+                      <a:ext cx="5667375" cy="5095875"/>
                     </a:xfrm>
                     <a:prstGeom prst="rect">
                       <a:avLst/>
@@ -23426,7 +23437,7 @@
           <w:sz w:val="20"/>
           <w:szCs w:val="20"/>
         </w:rPr>
-        <w:t xml:space="preserve">Figure 4: Ops page after a run with the naive strategy: 2,000 orders confirmed for 500 units (+1,500 oversold) while the database still shows 479 in stock, the lost-update bug. Redis shows 500 because the naive path does not use Redis.</w:t>
+        <w:t xml:space="preserve">Figure 4: Ops page after a run with the naive strategy: 5,000 orders confirmed for 500 units (+4,500 oversold) while the database still shows 436 in stock, the lost-update bug. Redis shows 500 because the naive path does not use Redis.</w:t>
       </w:r>
     </w:p>
     <w:p>
@@ -24592,7 +24603,7 @@
                 <w:sz w:val="18"/>
                 <w:szCs w:val="18"/>
               </w:rPr>
-              <w:t xml:space="preserve">0.9 s</w:t>
+              <w:t xml:space="preserve">1.1 s</w:t>
             </w:r>
           </w:p>
         </w:tc>
@@ -24716,7 +24727,7 @@
                 <w:sz w:val="18"/>
                 <w:szCs w:val="18"/>
               </w:rPr>
-              <w:t xml:space="preserve">0.023</w:t>
+              <w:t xml:space="preserve">0.051</w:t>
             </w:r>
           </w:p>
         </w:tc>
@@ -24747,7 +24758,7 @@
                 <w:sz w:val="18"/>
                 <w:szCs w:val="18"/>
               </w:rPr>
-              <w:t xml:space="preserve">19 KiB</w:t>
+              <w:t xml:space="preserve">42 KiB</w:t>
             </w:r>
           </w:p>
         </w:tc>
@@ -24877,7 +24888,7 @@
                 <w:sz w:val="18"/>
                 <w:szCs w:val="18"/>
               </w:rPr>
-              <w:t xml:space="preserve">0.4 s</w:t>
+              <w:t xml:space="preserve">0.3 s</w:t>
             </w:r>
           </w:p>
         </w:tc>
@@ -24908,7 +24919,7 @@
                 <w:sz w:val="18"/>
                 <w:szCs w:val="18"/>
               </w:rPr>
-              <w:t xml:space="preserve">0.4 s</w:t>
+              <w:t xml:space="preserve">0.3 s</w:t>
             </w:r>
           </w:p>
         </w:tc>
@@ -25001,7 +25012,7 @@
                 <w:sz w:val="18"/>
                 <w:szCs w:val="18"/>
               </w:rPr>
-              <w:t xml:space="preserve">19 KiB</w:t>
+              <w:t xml:space="preserve">42 KiB</w:t>
             </w:r>
           </w:p>
         </w:tc>
@@ -25029,7 +25040,7 @@
         <w:t xml:space="preserve">interactive</w:t>
       </w:r>
       <w:r>
-        <w:t xml:space="preserve"> audit: 1,402 ms on mobile, 363 ms on desktop). Lighthouse 12 no longer displays this metric in its visual report, so the figures below show the other metrics. These measurements were taken before the product illustration (a small SVG) was replaced by a 35 KB WebP photo, and have not been repeated since.</w:t>
+        <w:t xml:space="preserve"> audit: 1,433 ms on mobile, 327 ms on desktop). Lighthouse 12 no longer displays this metric in its visual report, so the figures below show the other metrics. Measured on the final page, including the 24 KB product image.</w:t>
       </w:r>
     </w:p>
     <w:p>
@@ -26126,7 +26137,7 @@
         <w:jc w:val="both"/>
       </w:pPr>
       <w:r>
-        <w:t xml:space="preserve">The screenshots in this section were captured after the final UI update (blue and lime accents, product photo, product name Shak-V1) by a script that goes through the same flows as the Playwright tests (</w:t>
+        <w:t xml:space="preserve">The screenshots in this section show the final UI: a plain white product page laid out like a large online store, with the product image, the details and a buy box. They were captured by a script that goes through the same flows as the Playwright tests (</w:t>
       </w:r>
       <w:r>
         <w:rPr>
@@ -26521,7 +26532,7 @@
       <w:r>
         <w:drawing>
           <wp:inline distT="0" distB="0" distL="0" distR="0">
-            <wp:extent cx="2152650" cy="5943600"/>
+            <wp:extent cx="1447800" cy="5943600"/>
             <wp:effectExtent t="0" r="0" b="0" l="0"/>
             <wp:docPr id="14" name="figure-14" descr="Mobile layout (390 px wide)" title="Mobile layout (390 px wide)"/>
             <wp:cNvGraphicFramePr>
@@ -26546,7 +26557,7 @@
                   <pic:spPr bwMode="auto">
                     <a:xfrm>
                       <a:off x="0" y="0"/>
-                      <a:ext cx="2152650" cy="5943600"/>
+                      <a:ext cx="1447800" cy="5943600"/>
                     </a:xfrm>
                     <a:prstGeom prst="rect">
                       <a:avLst/>
@@ -26583,7 +26594,7 @@
       <w:r>
         <w:drawing>
           <wp:inline distT="0" distB="0" distL="0" distR="0">
-            <wp:extent cx="5667375" cy="4781550"/>
+            <wp:extent cx="5667375" cy="4724400"/>
             <wp:effectExtent t="0" r="0" b="0" l="0"/>
             <wp:docPr id="15" name="figure-15" descr="Ops page after one order: Redis stock, database stock and confirmed orders agree" title="Ops page after one order: Redis stock, database stock and confirmed orders agree"/>
             <wp:cNvGraphicFramePr>
@@ -26608,7 +26619,7 @@
                   <pic:spPr bwMode="auto">
                     <a:xfrm>
                       <a:off x="0" y="0"/>
-                      <a:ext cx="5667375" cy="4781550"/>
+                      <a:ext cx="5667375" cy="4724400"/>
                     </a:xfrm>
                     <a:prstGeom prst="rect">
                       <a:avLst/>
@@ -27064,7 +27075,7 @@
                 <w:sz w:val="20"/>
                 <w:szCs w:val="20"/>
               </w:rPr>
-              <w:t xml:space="preserve">45.3 KB raw / 17.5 KB gzipped</w:t>
+              <w:t xml:space="preserve">47.5 KB raw / 18.0 KB gzipped</w:t>
             </w:r>
           </w:p>
         </w:tc>
@@ -27163,7 +27174,7 @@
                 <w:sz w:val="20"/>
                 <w:szCs w:val="20"/>
               </w:rPr>
-              <w:t xml:space="preserve">Lighthouse mobile 1.4 s, desktop 0.4 s</w:t>
+              <w:t xml:space="preserve">Lighthouse mobile 1.4 s, desktop 0.3 s</w:t>
             </w:r>
           </w:p>
         </w:tc>

</xml_diff>